<commit_message>
Update Bible resource content and metadata across multiple languages and formats
</commit_message>
<xml_diff>
--- a/eng/docx/015.content.docx
+++ b/eng/docx/015.content.docx
@@ -149,7 +149,7 @@
         <w:rPr>
           <w:lang w:val="en_US" w:bidi="en_US"/>
         </w:rPr>
-        <w:t>N</w:t>
+        <w:t>O</w:t>
       </w:r>
       <w:r>
         <w:rPr>
@@ -212,7 +212,7 @@
         <w:rPr>
           <w:lang w:val="en_US" w:bidi="en_US"/>
         </w:rPr>
-        <w:t>Natural Revelation</w:t>
+        <w:t>The Old Life and the New Life</w:t>
       </w:r>
       <w:r>
         <w:rPr>
@@ -231,46 +231,7 @@
         <w:rPr>
           <w:lang w:val="en_US" w:bidi="en_US"/>
         </w:rPr>
-        <w:t xml:space="preserve">When God speaks directly to people, we call it </w:t>
-      </w:r>
-      <w:r>
-        <w:rPr>
-          <w:i/>
-          <w:lang w:val="en_US" w:bidi="en_US"/>
-        </w:rPr>
-        <w:t>special revelation</w:t>
-      </w:r>
-      <w:r>
-        <w:rPr>
-          <w:lang w:val="en_US" w:bidi="en_US"/>
-        </w:rPr>
-        <w:t xml:space="preserve">. God also speaks to everyone indirectly through </w:t>
-      </w:r>
-      <w:r>
-        <w:rPr>
-          <w:i/>
-          <w:lang w:val="en_US" w:bidi="en_US"/>
-        </w:rPr>
-        <w:t>natural revelation</w:t>
-      </w:r>
-      <w:r>
-        <w:rPr>
-          <w:lang w:val="en_US" w:bidi="en_US"/>
-        </w:rPr>
-        <w:t xml:space="preserve"> (also known as </w:t>
-      </w:r>
-      <w:r>
-        <w:rPr>
-          <w:i/>
-          <w:lang w:val="en_US" w:bidi="en_US"/>
-        </w:rPr>
-        <w:t>general revelation</w:t>
-      </w:r>
-      <w:r>
-        <w:rPr>
-          <w:lang w:val="en_US" w:bidi="en_US"/>
-        </w:rPr>
-        <w:t xml:space="preserve"> because it is given to all). This happens through the natural world God created. For example, </w:t>
+        <w:t xml:space="preserve">When people become Christians, they unite with Jesus and share in his death and resurrection. Their old life, marked by sin, ends with Jesus. They start a new life through his power within them (see </w:t>
       </w:r>
       <w:hyperlink r:id="rId13">
         <w:r>
@@ -281,32 +242,14 @@
             <w:color w:val="0000EE"/>
             <w:u w:val="single"/>
           </w:rPr>
-          <w:t xml:space="preserve">Psalm 19 </w:t>
-        </w:r>
-      </w:hyperlink>
-      <w:r>
-        <w:rPr>
-          <w:lang w:val="en_US" w:bidi="en_US"/>
-        </w:rPr>
-        <w:t xml:space="preserve">says that knowledge of God in creation is available to everyone everywhere (see </w:t>
-      </w:r>
-      <w:hyperlink r:id="rId14">
-        <w:r>
-          <w:rPr>
-            <w:lang w:val="en_US" w:bidi="en_US"/>
-          </w:rPr>
-          <w:rPr>
-            <w:color w:val="0000EE"/>
-            <w:u w:val="single"/>
-          </w:rPr>
-          <w:t>Psalm 19:1–4</w:t>
-        </w:r>
-      </w:hyperlink>
-      <w:r>
-        <w:rPr>
-          <w:lang w:val="en_US" w:bidi="en_US"/>
-        </w:rPr>
-        <w:t>).</w:t>
+          <w:t>Romans 6:3–14</w:t>
+        </w:r>
+      </w:hyperlink>
+      <w:r>
+        <w:rPr>
+          <w:lang w:val="en_US" w:bidi="en_US"/>
+        </w:rPr>
+        <w:t xml:space="preserve">). </w:t>
       </w:r>
     </w:p>
     <w:p>
@@ -320,7 +263,25 @@
         <w:rPr>
           <w:lang w:val="en_US" w:bidi="en_US"/>
         </w:rPr>
-        <w:t xml:space="preserve">Sadly, not everyone responds positively to God. Paul explains in </w:t>
+        <w:t xml:space="preserve">God transforms them by his Spirit. Their minds are renewed (see </w:t>
+      </w:r>
+      <w:hyperlink r:id="rId14">
+        <w:r>
+          <w:rPr>
+            <w:lang w:val="en_US" w:bidi="en_US"/>
+          </w:rPr>
+          <w:rPr>
+            <w:color w:val="0000EE"/>
+            <w:u w:val="single"/>
+          </w:rPr>
+          <w:t>Romans 12:2</w:t>
+        </w:r>
+      </w:hyperlink>
+      <w:r>
+        <w:rPr>
+          <w:lang w:val="en_US" w:bidi="en_US"/>
+        </w:rPr>
+        <w:t>). Their desires and actions change, and their lives begin to show his Spirit (</w:t>
       </w:r>
       <w:hyperlink r:id="rId15">
         <w:r>
@@ -331,32 +292,14 @@
             <w:color w:val="0000EE"/>
             <w:u w:val="single"/>
           </w:rPr>
-          <w:t>Romans 1–3</w:t>
-        </w:r>
-      </w:hyperlink>
-      <w:r>
-        <w:rPr>
-          <w:lang w:val="en_US" w:bidi="en_US"/>
-        </w:rPr>
-        <w:t xml:space="preserve"> that because of Adam's sin, all people turn away from the knowledge of God found in creation. Without God's grace, natural revelation only condemns people. As Paul says in </w:t>
-      </w:r>
-      <w:hyperlink r:id="rId16">
-        <w:r>
-          <w:rPr>
-            <w:lang w:val="en_US" w:bidi="en_US"/>
-          </w:rPr>
-          <w:rPr>
-            <w:color w:val="0000EE"/>
-            <w:u w:val="single"/>
-          </w:rPr>
-          <w:t>1:20</w:t>
-        </w:r>
-      </w:hyperlink>
-      <w:r>
-        <w:rPr>
-          <w:lang w:val="en_US" w:bidi="en_US"/>
-        </w:rPr>
-        <w:t>, people "are without excuse.”</w:t>
+          <w:t>Galatians 5:22–23</w:t>
+        </w:r>
+      </w:hyperlink>
+      <w:r>
+        <w:rPr>
+          <w:lang w:val="en_US" w:bidi="en_US"/>
+        </w:rPr>
+        <w:t>). They begin to spiritually grow and become more like Jesus.</w:t>
       </w:r>
     </w:p>
     <w:p>
@@ -370,7 +313,25 @@
         <w:rPr>
           <w:lang w:val="en_US" w:bidi="en_US"/>
         </w:rPr>
-        <w:t>God can use creation to help people realize he is the one true God. When God's grace supports and empowers this natural revelation, the world's beauty and complexity can inspire a search for the Creator. Paul appealed to natural revelation when he was in Athens as a way to introduce the good news about Jesus (</w:t>
+        <w:t xml:space="preserve">Christians have a duty to be "conformed" to Jesus' death and resurrection (see </w:t>
+      </w:r>
+      <w:hyperlink r:id="rId16">
+        <w:r>
+          <w:rPr>
+            <w:lang w:val="en_US" w:bidi="en_US"/>
+          </w:rPr>
+          <w:rPr>
+            <w:color w:val="0000EE"/>
+            <w:u w:val="single"/>
+          </w:rPr>
+          <w:t>Philippians 3:10–14</w:t>
+        </w:r>
+      </w:hyperlink>
+      <w:r>
+        <w:rPr>
+          <w:lang w:val="en_US" w:bidi="en_US"/>
+        </w:rPr>
+        <w:t>). They must turn away from darkness and commit to a life full of light (</w:t>
       </w:r>
       <w:hyperlink r:id="rId17">
         <w:r>
@@ -381,14 +342,68 @@
             <w:color w:val="0000EE"/>
             <w:u w:val="single"/>
           </w:rPr>
-          <w:t>Acts 17:16–31</w:t>
-        </w:r>
-      </w:hyperlink>
-      <w:r>
-        <w:rPr>
-          <w:lang w:val="en_US" w:bidi="en_US"/>
-        </w:rPr>
-        <w:t>). God's revelation in the natural world and in human nature can encourage people to search for him. And then, through the special revelation God has ultimately given in his Son, Jesus Christ, people can truly know him and experience salvation.</w:t>
+          <w:t>Ephesians 4:17–5:20</w:t>
+        </w:r>
+      </w:hyperlink>
+      <w:r>
+        <w:rPr>
+          <w:lang w:val="en_US" w:bidi="en_US"/>
+        </w:rPr>
+        <w:t>). This means they are to stop living in evil ways and start living in God's good ways. The apostle Paul describes this change using the image of clothing. God calls Christians to remove the old, sinful life influenced by the devil and put on a new, pure life guided by the Holy Spirit (</w:t>
+      </w:r>
+      <w:hyperlink r:id="rId18">
+        <w:r>
+          <w:rPr>
+            <w:lang w:val="en_US" w:bidi="en_US"/>
+          </w:rPr>
+          <w:rPr>
+            <w:color w:val="0000EE"/>
+            <w:u w:val="single"/>
+          </w:rPr>
+          <w:t>Ephesians 4:21–24</w:t>
+        </w:r>
+      </w:hyperlink>
+      <w:r>
+        <w:rPr>
+          <w:lang w:val="en_US" w:bidi="en_US"/>
+        </w:rPr>
+        <w:t xml:space="preserve">; </w:t>
+      </w:r>
+      <w:hyperlink r:id="rId19">
+        <w:r>
+          <w:rPr>
+            <w:lang w:val="en_US" w:bidi="en_US"/>
+          </w:rPr>
+          <w:rPr>
+            <w:color w:val="0000EE"/>
+            <w:u w:val="single"/>
+          </w:rPr>
+          <w:t>Colossians 3:1–15</w:t>
+        </w:r>
+      </w:hyperlink>
+      <w:r>
+        <w:rPr>
+          <w:lang w:val="en_US" w:bidi="en_US"/>
+        </w:rPr>
+        <w:t xml:space="preserve">; see also </w:t>
+      </w:r>
+      <w:hyperlink r:id="rId20">
+        <w:r>
+          <w:rPr>
+            <w:lang w:val="en_US" w:bidi="en_US"/>
+          </w:rPr>
+          <w:rPr>
+            <w:color w:val="0000EE"/>
+            <w:u w:val="single"/>
+          </w:rPr>
+          <w:t>Galatians 3:27</w:t>
+        </w:r>
+      </w:hyperlink>
+      <w:r>
+        <w:rPr>
+          <w:lang w:val="en_US" w:bidi="en_US"/>
+        </w:rPr>
+        <w:t>). In doing so, they acknowledge their dependence on God’s grace and power.</w:t>
       </w:r>
     </w:p>
     <w:p>
@@ -413,16 +428,16 @@
           <w:lang w:val="en_US" w:bidi="en_US"/>
         </w:rPr>
       </w:r>
-      <w:hyperlink r:id="rId14">
-        <w:r>
-          <w:rPr>
-            <w:lang w:val="en_US" w:bidi="en_US"/>
-          </w:rPr>
-          <w:rPr>
-            <w:color w:val="0000EE"/>
-            <w:u w:val="single"/>
-          </w:rPr>
-          <w:t>Psalm 19:1–4</w:t>
+      <w:hyperlink r:id="rId13">
+        <w:r>
+          <w:rPr>
+            <w:lang w:val="en_US" w:bidi="en_US"/>
+          </w:rPr>
+          <w:rPr>
+            <w:color w:val="0000EE"/>
+            <w:u w:val="single"/>
+          </w:rPr>
+          <w:t>Romans 6:3–14</w:t>
         </w:r>
       </w:hyperlink>
       <w:r>
@@ -431,16 +446,16 @@
         </w:rPr>
         <w:t xml:space="preserve">; </w:t>
       </w:r>
-      <w:hyperlink r:id="rId18">
-        <w:r>
-          <w:rPr>
-            <w:lang w:val="en_US" w:bidi="en_US"/>
-          </w:rPr>
-          <w:rPr>
-            <w:color w:val="0000EE"/>
-            <w:u w:val="single"/>
-          </w:rPr>
-          <w:t>Acts 14:15–17</w:t>
+      <w:hyperlink r:id="rId21">
+        <w:r>
+          <w:rPr>
+            <w:lang w:val="en_US" w:bidi="en_US"/>
+          </w:rPr>
+          <w:rPr>
+            <w:color w:val="0000EE"/>
+            <w:u w:val="single"/>
+          </w:rPr>
+          <w:t>12:1–2</w:t>
         </w:r>
       </w:hyperlink>
       <w:r>
@@ -449,16 +464,16 @@
         </w:rPr>
         <w:t xml:space="preserve">; </w:t>
       </w:r>
-      <w:hyperlink r:id="rId19">
-        <w:r>
-          <w:rPr>
-            <w:lang w:val="en_US" w:bidi="en_US"/>
-          </w:rPr>
-          <w:rPr>
-            <w:color w:val="0000EE"/>
-            <w:u w:val="single"/>
-          </w:rPr>
-          <w:t>Acts 17:24–29</w:t>
+      <w:hyperlink r:id="rId22">
+        <w:r>
+          <w:rPr>
+            <w:lang w:val="en_US" w:bidi="en_US"/>
+          </w:rPr>
+          <w:rPr>
+            <w:color w:val="0000EE"/>
+            <w:u w:val="single"/>
+          </w:rPr>
+          <w:t>Galatians 5:19–23</w:t>
         </w:r>
       </w:hyperlink>
       <w:r>
@@ -467,16 +482,34 @@
         </w:rPr>
         <w:t xml:space="preserve">; </w:t>
       </w:r>
-      <w:hyperlink r:id="rId20">
-        <w:r>
-          <w:rPr>
-            <w:lang w:val="en_US" w:bidi="en_US"/>
-          </w:rPr>
-          <w:rPr>
-            <w:color w:val="0000EE"/>
-            <w:u w:val="single"/>
-          </w:rPr>
-          <w:t>Romans 1:19–21</w:t>
+      <w:hyperlink r:id="rId17">
+        <w:r>
+          <w:rPr>
+            <w:lang w:val="en_US" w:bidi="en_US"/>
+          </w:rPr>
+          <w:rPr>
+            <w:color w:val="0000EE"/>
+            <w:u w:val="single"/>
+          </w:rPr>
+          <w:t>Ephesians 4:17–5:20</w:t>
+        </w:r>
+      </w:hyperlink>
+      <w:r>
+        <w:rPr>
+          <w:lang w:val="en_US" w:bidi="en_US"/>
+        </w:rPr>
+        <w:t xml:space="preserve">; </w:t>
+      </w:r>
+      <w:hyperlink r:id="rId23">
+        <w:r>
+          <w:rPr>
+            <w:lang w:val="en_US" w:bidi="en_US"/>
+          </w:rPr>
+          <w:rPr>
+            <w:color w:val="0000EE"/>
+            <w:u w:val="single"/>
+          </w:rPr>
+          <w:t>Philippians 3:12–14</w:t>
         </w:r>
       </w:hyperlink>
       <w:r>
@@ -506,7 +539,7 @@
         <w:rPr>
           <w:lang w:val="en_US" w:bidi="en_US"/>
         </w:rPr>
-        <w:t>Nehemiah’s Confidence in God</w:t>
+        <w:t>The Old Realm and the New</w:t>
       </w:r>
       <w:r>
         <w:rPr>
@@ -525,79 +558,7 @@
         <w:rPr>
           <w:lang w:val="en_US" w:bidi="en_US"/>
         </w:rPr>
-        <w:t>God gave the prophet Nehemiah favor with a powerful Persian king. The king agreed to all of Nehemiah's requests (</w:t>
-      </w:r>
-      <w:hyperlink r:id="rId21">
-        <w:r>
-          <w:rPr>
-            <w:lang w:val="en_US" w:bidi="en_US"/>
-          </w:rPr>
-          <w:rPr>
-            <w:color w:val="0000EE"/>
-            <w:u w:val="single"/>
-          </w:rPr>
-          <w:t>Nehemiah 1:11</w:t>
-        </w:r>
-      </w:hyperlink>
-      <w:r>
-        <w:rPr>
-          <w:lang w:val="en_US" w:bidi="en_US"/>
-        </w:rPr>
-        <w:t xml:space="preserve">; </w:t>
-      </w:r>
-      <w:hyperlink r:id="rId22">
-        <w:r>
-          <w:rPr>
-            <w:lang w:val="en_US" w:bidi="en_US"/>
-          </w:rPr>
-          <w:rPr>
-            <w:color w:val="0000EE"/>
-            <w:u w:val="single"/>
-          </w:rPr>
-          <w:t>2:8</w:t>
-        </w:r>
-      </w:hyperlink>
-      <w:r>
-        <w:rPr>
-          <w:lang w:val="en_US" w:bidi="en_US"/>
-        </w:rPr>
-        <w:t xml:space="preserve">, </w:t>
-      </w:r>
-      <w:hyperlink r:id="rId23">
-        <w:r>
-          <w:rPr>
-            <w:lang w:val="en_US" w:bidi="en_US"/>
-          </w:rPr>
-          <w:rPr>
-            <w:color w:val="0000EE"/>
-            <w:u w:val="single"/>
-          </w:rPr>
-          <w:t>18</w:t>
-        </w:r>
-      </w:hyperlink>
-      <w:r>
-        <w:rPr>
-          <w:lang w:val="en_US" w:bidi="en_US"/>
-        </w:rPr>
-        <w:t>). Nehemiah then confidently shared his bold plan to rebuild Jerusalem's walls. The people of Jerusalem trusted God would help them succeed and protect them from enemies (</w:t>
-      </w:r>
-      <w:hyperlink r:id="rId23">
-        <w:r>
-          <w:rPr>
-            <w:lang w:val="en_US" w:bidi="en_US"/>
-          </w:rPr>
-          <w:rPr>
-            <w:color w:val="0000EE"/>
-            <w:u w:val="single"/>
-          </w:rPr>
-          <w:t>2:18</w:t>
-        </w:r>
-      </w:hyperlink>
-      <w:r>
-        <w:rPr>
-          <w:lang w:val="en_US" w:bidi="en_US"/>
-        </w:rPr>
-        <w:t xml:space="preserve">; </w:t>
+        <w:t xml:space="preserve">The Jewish people in Paul's time saw a clear difference between the "present evil age" and a "glorious age to come." Throughout </w:t>
       </w:r>
       <w:hyperlink r:id="rId24">
         <w:r>
@@ -608,32 +569,14 @@
             <w:color w:val="0000EE"/>
             <w:u w:val="single"/>
           </w:rPr>
-          <w:t>4:4–5</w:t>
-        </w:r>
-      </w:hyperlink>
-      <w:r>
-        <w:rPr>
-          <w:lang w:val="en_US" w:bidi="en_US"/>
-        </w:rPr>
-        <w:t xml:space="preserve">, </w:t>
-      </w:r>
-      <w:hyperlink r:id="rId25">
-        <w:r>
-          <w:rPr>
-            <w:lang w:val="en_US" w:bidi="en_US"/>
-          </w:rPr>
-          <w:rPr>
-            <w:color w:val="0000EE"/>
-            <w:u w:val="single"/>
-          </w:rPr>
-          <w:t>9</w:t>
-        </w:r>
-      </w:hyperlink>
-      <w:r>
-        <w:rPr>
-          <w:lang w:val="en_US" w:bidi="en_US"/>
-        </w:rPr>
-        <w:t xml:space="preserve">). </w:t>
+          <w:t>Romans 5–8</w:t>
+        </w:r>
+      </w:hyperlink>
+      <w:r>
+        <w:rPr>
+          <w:lang w:val="en_US" w:bidi="en_US"/>
+        </w:rPr>
+        <w:t xml:space="preserve">, Paul uses these contrasting "realms" or "kingdoms" to explain our experience of salvation. </w:t>
       </w:r>
     </w:p>
     <w:p>
@@ -647,7 +590,61 @@
         <w:rPr>
           <w:lang w:val="en_US" w:bidi="en_US"/>
         </w:rPr>
-        <w:t>They continued their work despite opposition. They knew God fights for his people and disrupts evil plans (</w:t>
+        <w:t xml:space="preserve">The rulers of the old realm are: </w:t>
+      </w:r>
+    </w:p>
+    <w:p>
+      <w:pPr>
+        <w:pStyle w:val="ListBullet"/>
+        <w:spacing w:line="240" w:lineRule="auto"/>
+        <w:ind w:left="720"/>
+      </w:pPr>
+      <w:r>
+        <w:rPr>
+          <w:lang w:val="en_US" w:bidi="en_US"/>
+        </w:rPr>
+      </w:r>
+      <w:r>
+        <w:rPr>
+          <w:lang w:val="en_US" w:bidi="en_US"/>
+        </w:rPr>
+        <w:t>death (</w:t>
+      </w:r>
+      <w:hyperlink r:id="rId25">
+        <w:r>
+          <w:rPr>
+            <w:lang w:val="en_US" w:bidi="en_US"/>
+          </w:rPr>
+          <w:rPr>
+            <w:color w:val="0000EE"/>
+            <w:u w:val="single"/>
+          </w:rPr>
+          <w:t>Romans 5:12–21</w:t>
+        </w:r>
+      </w:hyperlink>
+      <w:r>
+        <w:rPr>
+          <w:lang w:val="en_US" w:bidi="en_US"/>
+        </w:rPr>
+        <w:t>);</w:t>
+      </w:r>
+    </w:p>
+    <w:p>
+      <w:pPr>
+        <w:pStyle w:val="ListBullet"/>
+        <w:spacing w:line="240" w:lineRule="auto"/>
+        <w:ind w:left="720"/>
+      </w:pPr>
+      <w:r>
+        <w:rPr>
+          <w:lang w:val="en_US" w:bidi="en_US"/>
+        </w:rPr>
+      </w:r>
+      <w:r>
+        <w:rPr>
+          <w:lang w:val="en_US" w:bidi="en_US"/>
+        </w:rPr>
+        <w:t xml:space="preserve">sin (chapter </w:t>
       </w:r>
       <w:hyperlink r:id="rId26">
         <w:r>
@@ -658,14 +655,32 @@
             <w:color w:val="0000EE"/>
             <w:u w:val="single"/>
           </w:rPr>
-          <w:t>4:14–15</w:t>
-        </w:r>
-      </w:hyperlink>
-      <w:r>
-        <w:rPr>
-          <w:lang w:val="en_US" w:bidi="en_US"/>
-        </w:rPr>
-        <w:t xml:space="preserve">, </w:t>
+          <w:t>6</w:t>
+        </w:r>
+      </w:hyperlink>
+      <w:r>
+        <w:rPr>
+          <w:lang w:val="en_US" w:bidi="en_US"/>
+        </w:rPr>
+        <w:t>);</w:t>
+      </w:r>
+    </w:p>
+    <w:p>
+      <w:pPr>
+        <w:pStyle w:val="ListBullet"/>
+        <w:spacing w:line="240" w:lineRule="auto"/>
+        <w:ind w:left="720"/>
+      </w:pPr>
+      <w:r>
+        <w:rPr>
+          <w:lang w:val="en_US" w:bidi="en_US"/>
+        </w:rPr>
+      </w:r>
+      <w:r>
+        <w:rPr>
+          <w:lang w:val="en_US" w:bidi="en_US"/>
+        </w:rPr>
+        <w:t xml:space="preserve">the law (chapter </w:t>
       </w:r>
       <w:hyperlink r:id="rId27">
         <w:r>
@@ -676,14 +691,32 @@
             <w:color w:val="0000EE"/>
             <w:u w:val="single"/>
           </w:rPr>
-          <w:t>20</w:t>
-        </w:r>
-      </w:hyperlink>
-      <w:r>
-        <w:rPr>
-          <w:lang w:val="en_US" w:bidi="en_US"/>
-        </w:rPr>
-        <w:t>). When they completed the walls, Nehemiah acknowledged that the challenging project succeeded only with God's help (</w:t>
+          <w:t>7</w:t>
+        </w:r>
+      </w:hyperlink>
+      <w:r>
+        <w:rPr>
+          <w:lang w:val="en_US" w:bidi="en_US"/>
+        </w:rPr>
+        <w:t>); and</w:t>
+      </w:r>
+    </w:p>
+    <w:p>
+      <w:pPr>
+        <w:pStyle w:val="ListBullet"/>
+        <w:spacing w:line="240" w:lineRule="auto"/>
+        <w:ind w:left="720"/>
+      </w:pPr>
+      <w:r>
+        <w:rPr>
+          <w:lang w:val="en_US" w:bidi="en_US"/>
+        </w:rPr>
+      </w:r>
+      <w:r>
+        <w:rPr>
+          <w:lang w:val="en_US" w:bidi="en_US"/>
+        </w:rPr>
+        <w:t xml:space="preserve">sinful nature ("the flesh" in </w:t>
       </w:r>
       <w:hyperlink r:id="rId28">
         <w:r>
@@ -694,14 +727,14 @@
             <w:color w:val="0000EE"/>
             <w:u w:val="single"/>
           </w:rPr>
-          <w:t>6:16</w:t>
-        </w:r>
-      </w:hyperlink>
-      <w:r>
-        <w:rPr>
-          <w:lang w:val="en_US" w:bidi="en_US"/>
-        </w:rPr>
-        <w:t>).</w:t>
+          <w:t>8:1–11</w:t>
+        </w:r>
+      </w:hyperlink>
+      <w:r>
+        <w:rPr>
+          <w:lang w:val="en_US" w:bidi="en_US"/>
+        </w:rPr>
+        <w:t xml:space="preserve">). </w:t>
       </w:r>
     </w:p>
     <w:p>
@@ -715,7 +748,25 @@
         <w:rPr>
           <w:lang w:val="en_US" w:bidi="en_US"/>
         </w:rPr>
-        <w:t xml:space="preserve">The book of Nehemiah shows that God is all-powerful and can achieve his plans in both personal lives and nations. The prayer in </w:t>
+        <w:t>The new realm is characterized by:</w:t>
+      </w:r>
+    </w:p>
+    <w:p>
+      <w:pPr>
+        <w:pStyle w:val="ListBullet"/>
+        <w:spacing w:line="240" w:lineRule="auto"/>
+        <w:ind w:left="720"/>
+      </w:pPr>
+      <w:r>
+        <w:rPr>
+          <w:lang w:val="en_US" w:bidi="en_US"/>
+        </w:rPr>
+      </w:r>
+      <w:r>
+        <w:rPr>
+          <w:lang w:val="en_US" w:bidi="en_US"/>
+        </w:rPr>
+        <w:t>life (</w:t>
       </w:r>
       <w:hyperlink r:id="rId29">
         <w:r>
@@ -726,14 +777,104 @@
             <w:color w:val="0000EE"/>
             <w:u w:val="single"/>
           </w:rPr>
-          <w:t>Nehemiah 9</w:t>
-        </w:r>
-      </w:hyperlink>
-      <w:r>
-        <w:rPr>
-          <w:lang w:val="en_US" w:bidi="en_US"/>
-        </w:rPr>
-        <w:t xml:space="preserve"> praises God for his powerful acts. God created the heavens and earth, called Abram from Ur, and gave the land to Israel (</w:t>
+          <w:t>Romans 5</w:t>
+        </w:r>
+      </w:hyperlink>
+      <w:r>
+        <w:rPr>
+          <w:lang w:val="en_US" w:bidi="en_US"/>
+        </w:rPr>
+        <w:t>);</w:t>
+      </w:r>
+    </w:p>
+    <w:p>
+      <w:pPr>
+        <w:pStyle w:val="ListBullet"/>
+        <w:spacing w:line="240" w:lineRule="auto"/>
+        <w:ind w:left="720"/>
+      </w:pPr>
+      <w:r>
+        <w:rPr>
+          <w:lang w:val="en_US" w:bidi="en_US"/>
+        </w:rPr>
+      </w:r>
+      <w:r>
+        <w:rPr>
+          <w:lang w:val="en_US" w:bidi="en_US"/>
+        </w:rPr>
+        <w:t xml:space="preserve">righteous living (chapter </w:t>
+      </w:r>
+      <w:hyperlink r:id="rId26">
+        <w:r>
+          <w:rPr>
+            <w:lang w:val="en_US" w:bidi="en_US"/>
+          </w:rPr>
+          <w:rPr>
+            <w:color w:val="0000EE"/>
+            <w:u w:val="single"/>
+          </w:rPr>
+          <w:t>6</w:t>
+        </w:r>
+      </w:hyperlink>
+      <w:r>
+        <w:rPr>
+          <w:lang w:val="en_US" w:bidi="en_US"/>
+        </w:rPr>
+        <w:t>);</w:t>
+      </w:r>
+    </w:p>
+    <w:p>
+      <w:pPr>
+        <w:pStyle w:val="ListBullet"/>
+        <w:spacing w:line="240" w:lineRule="auto"/>
+        <w:ind w:left="720"/>
+      </w:pPr>
+      <w:r>
+        <w:rPr>
+          <w:lang w:val="en_US" w:bidi="en_US"/>
+        </w:rPr>
+      </w:r>
+      <w:r>
+        <w:rPr>
+          <w:lang w:val="en_US" w:bidi="en_US"/>
+        </w:rPr>
+        <w:t xml:space="preserve">grace (chapter </w:t>
+      </w:r>
+      <w:hyperlink r:id="rId26">
+        <w:r>
+          <w:rPr>
+            <w:lang w:val="en_US" w:bidi="en_US"/>
+          </w:rPr>
+          <w:rPr>
+            <w:color w:val="0000EE"/>
+            <w:u w:val="single"/>
+          </w:rPr>
+          <w:t>6</w:t>
+        </w:r>
+      </w:hyperlink>
+      <w:r>
+        <w:rPr>
+          <w:lang w:val="en_US" w:bidi="en_US"/>
+        </w:rPr>
+        <w:t>); and</w:t>
+      </w:r>
+    </w:p>
+    <w:p>
+      <w:pPr>
+        <w:pStyle w:val="ListBullet"/>
+        <w:spacing w:line="240" w:lineRule="auto"/>
+        <w:ind w:left="720"/>
+      </w:pPr>
+      <w:r>
+        <w:rPr>
+          <w:lang w:val="en_US" w:bidi="en_US"/>
+        </w:rPr>
+      </w:r>
+      <w:r>
+        <w:rPr>
+          <w:lang w:val="en_US" w:bidi="en_US"/>
+        </w:rPr>
+        <w:t xml:space="preserve">the Holy Spirit (chapter </w:t>
       </w:r>
       <w:hyperlink r:id="rId30">
         <w:r>
@@ -744,43 +885,7 @@
             <w:color w:val="0000EE"/>
             <w:u w:val="single"/>
           </w:rPr>
-          <w:t>9:6</w:t>
-        </w:r>
-      </w:hyperlink>
-      <w:r>
-        <w:rPr>
-          <w:lang w:val="en_US" w:bidi="en_US"/>
-        </w:rPr>
-        <w:t xml:space="preserve">; </w:t>
-      </w:r>
-      <w:hyperlink r:id="rId31">
-        <w:r>
-          <w:rPr>
-            <w:lang w:val="en_US" w:bidi="en_US"/>
-          </w:rPr>
-          <w:rPr>
-            <w:color w:val="0000EE"/>
-            <w:u w:val="single"/>
-          </w:rPr>
-          <w:t>7–8</w:t>
-        </w:r>
-      </w:hyperlink>
-      <w:r>
-        <w:rPr>
-          <w:lang w:val="en_US" w:bidi="en_US"/>
-        </w:rPr>
-        <w:t xml:space="preserve">, </w:t>
-      </w:r>
-      <w:hyperlink r:id="rId32">
-        <w:r>
-          <w:rPr>
-            <w:lang w:val="en_US" w:bidi="en_US"/>
-          </w:rPr>
-          <w:rPr>
-            <w:color w:val="0000EE"/>
-            <w:u w:val="single"/>
-          </w:rPr>
-          <w:t>22–25</w:t>
+          <w:t>8</w:t>
         </w:r>
       </w:hyperlink>
       <w:r>
@@ -801,83 +906,7 @@
         <w:rPr>
           <w:lang w:val="en_US" w:bidi="en_US"/>
         </w:rPr>
-        <w:t>God demonstrated his power over people and creation to show care for his people in three main ways (</w:t>
-      </w:r>
-      <w:hyperlink r:id="rId33">
-        <w:r>
-          <w:rPr>
-            <w:lang w:val="en_US" w:bidi="en_US"/>
-          </w:rPr>
-          <w:rPr>
-            <w:color w:val="0000EE"/>
-            <w:u w:val="single"/>
-          </w:rPr>
-          <w:t>9:9–15</w:t>
-        </w:r>
-      </w:hyperlink>
-      <w:r>
-        <w:rPr>
-          <w:lang w:val="en_US" w:bidi="en_US"/>
-        </w:rPr>
-        <w:t>):</w:t>
-      </w:r>
-    </w:p>
-    <w:p>
-      <w:pPr>
-        <w:pStyle w:val="ListNumber"/>
-        <w:numPr>
-          <w:ilvl w:val="0"/>
-          <w:numId w:val="14"/>
-        </w:numPr>
-        <w:spacing w:line="240" w:lineRule="auto"/>
-        <w:ind w:left="720"/>
-      </w:pPr>
-      <w:r>
-        <w:rPr>
-          <w:lang w:val="en_US" w:bidi="en_US"/>
-        </w:rPr>
-      </w:r>
-      <w:r>
-        <w:rPr>
-          <w:lang w:val="en_US" w:bidi="en_US"/>
-        </w:rPr>
-        <w:t>The miraculous signs in Egypt.</w:t>
-      </w:r>
-    </w:p>
-    <w:p>
-      <w:pPr>
-        <w:pStyle w:val="ListNumber"/>
-        <w:spacing w:line="240" w:lineRule="auto"/>
-        <w:ind w:left="720"/>
-      </w:pPr>
-      <w:r>
-        <w:rPr>
-          <w:lang w:val="en_US" w:bidi="en_US"/>
-        </w:rPr>
-      </w:r>
-      <w:r>
-        <w:rPr>
-          <w:lang w:val="en_US" w:bidi="en_US"/>
-        </w:rPr>
-        <w:t>The parting of the Red Sea.</w:t>
-      </w:r>
-    </w:p>
-    <w:p>
-      <w:pPr>
-        <w:pStyle w:val="ListNumber"/>
-        <w:spacing w:line="240" w:lineRule="auto"/>
-        <w:ind w:left="720"/>
-      </w:pPr>
-      <w:r>
-        <w:rPr>
-          <w:lang w:val="en_US" w:bidi="en_US"/>
-        </w:rPr>
-      </w:r>
-      <w:r>
-        <w:rPr>
-          <w:lang w:val="en_US" w:bidi="en_US"/>
-        </w:rPr>
-        <w:t>The provision of guidance, food, and water in the wilderness.</w:t>
+        <w:t>A person's future depends directly on which of these two realms they belong to.</w:t>
       </w:r>
     </w:p>
     <w:p>
@@ -891,43 +920,43 @@
         <w:rPr>
           <w:lang w:val="en_US" w:bidi="en_US"/>
         </w:rPr>
-        <w:t>The Lord sent the Israelites into exile after many generations of sin (</w:t>
-      </w:r>
-      <w:hyperlink r:id="rId34">
-        <w:r>
-          <w:rPr>
-            <w:lang w:val="en_US" w:bidi="en_US"/>
-          </w:rPr>
-          <w:rPr>
-            <w:color w:val="0000EE"/>
-            <w:u w:val="single"/>
-          </w:rPr>
-          <w:t>Nehemiah 9:32–37</w:t>
-        </w:r>
-      </w:hyperlink>
-      <w:r>
-        <w:rPr>
-          <w:lang w:val="en_US" w:bidi="en_US"/>
-        </w:rPr>
-        <w:t>). Now, he was fulfilling his promise to restore them (</w:t>
-      </w:r>
-      <w:hyperlink r:id="rId35">
-        <w:r>
-          <w:rPr>
-            <w:lang w:val="en_US" w:bidi="en_US"/>
-          </w:rPr>
-          <w:rPr>
-            <w:color w:val="0000EE"/>
-            <w:u w:val="single"/>
-          </w:rPr>
-          <w:t>1:8–9</w:t>
-        </w:r>
-      </w:hyperlink>
-      <w:r>
-        <w:rPr>
-          <w:lang w:val="en_US" w:bidi="en_US"/>
-        </w:rPr>
-        <w:t xml:space="preserve">). Nehemiah prayed and led with confidence because he knew everything was part of God's plan. </w:t>
+        <w:t>Each realm has a leader representing its people. Adam, the first man, leads the old realm of sin and death. Christ leads the new realm of forgiveness and life. By nature, all humans belong to the old realm of sin and death, represented by Adam. His sin and death affect everyone's future (</w:t>
+      </w:r>
+      <w:hyperlink r:id="rId31">
+        <w:r>
+          <w:rPr>
+            <w:lang w:val="en_US" w:bidi="en_US"/>
+          </w:rPr>
+          <w:rPr>
+            <w:color w:val="0000EE"/>
+            <w:u w:val="single"/>
+          </w:rPr>
+          <w:t>Romans 5:12</w:t>
+        </w:r>
+      </w:hyperlink>
+      <w:r>
+        <w:rPr>
+          <w:lang w:val="en_US" w:bidi="en_US"/>
+        </w:rPr>
+        <w:t xml:space="preserve">, </w:t>
+      </w:r>
+      <w:hyperlink r:id="rId32">
+        <w:r>
+          <w:rPr>
+            <w:lang w:val="en_US" w:bidi="en_US"/>
+          </w:rPr>
+          <w:rPr>
+            <w:color w:val="0000EE"/>
+            <w:u w:val="single"/>
+          </w:rPr>
+          <w:t>18–19</w:t>
+        </w:r>
+      </w:hyperlink>
+      <w:r>
+        <w:rPr>
+          <w:lang w:val="en_US" w:bidi="en_US"/>
+        </w:rPr>
+        <w:t xml:space="preserve">). </w:t>
       </w:r>
     </w:p>
     <w:p>
@@ -941,108 +970,54 @@
         <w:rPr>
           <w:lang w:val="en_US" w:bidi="en_US"/>
         </w:rPr>
-        <w:t>This same trust in God led Abram to leave Ur and go to an unknown land (</w:t>
-      </w:r>
-      <w:hyperlink r:id="rId36">
-        <w:r>
-          <w:rPr>
-            <w:lang w:val="en_US" w:bidi="en_US"/>
-          </w:rPr>
-          <w:rPr>
-            <w:color w:val="0000EE"/>
-            <w:u w:val="single"/>
-          </w:rPr>
-          <w:t>Genesis 12:1–3</w:t>
-        </w:r>
-      </w:hyperlink>
-      <w:r>
-        <w:rPr>
-          <w:lang w:val="en_US" w:bidi="en_US"/>
-        </w:rPr>
-        <w:t xml:space="preserve">; </w:t>
-      </w:r>
-      <w:hyperlink r:id="rId37">
-        <w:r>
-          <w:rPr>
-            <w:lang w:val="en_US" w:bidi="en_US"/>
-          </w:rPr>
-          <w:rPr>
-            <w:color w:val="0000EE"/>
-            <w:u w:val="single"/>
-          </w:rPr>
-          <w:t>Hebrews 11:8–10</w:t>
-        </w:r>
-      </w:hyperlink>
-      <w:r>
-        <w:rPr>
-          <w:lang w:val="en_US" w:bidi="en_US"/>
-        </w:rPr>
-        <w:t>). It caused Rahab to trust God (</w:t>
-      </w:r>
-      <w:hyperlink r:id="rId38">
-        <w:r>
-          <w:rPr>
-            <w:lang w:val="en_US" w:bidi="en_US"/>
-          </w:rPr>
-          <w:rPr>
-            <w:color w:val="0000EE"/>
-            <w:u w:val="single"/>
-          </w:rPr>
-          <w:t>Joshua 2:9–14</w:t>
-        </w:r>
-      </w:hyperlink>
-      <w:r>
-        <w:rPr>
-          <w:lang w:val="en_US" w:bidi="en_US"/>
-        </w:rPr>
-        <w:t xml:space="preserve">; </w:t>
-      </w:r>
-      <w:hyperlink r:id="rId39">
-        <w:r>
-          <w:rPr>
-            <w:lang w:val="en_US" w:bidi="en_US"/>
-          </w:rPr>
-          <w:rPr>
-            <w:color w:val="0000EE"/>
-            <w:u w:val="single"/>
-          </w:rPr>
-          <w:t>Hebrews 11:31</w:t>
-        </w:r>
-      </w:hyperlink>
-      <w:r>
-        <w:rPr>
-          <w:lang w:val="en_US" w:bidi="en_US"/>
-        </w:rPr>
-        <w:t>). It prompted King Hezekiah to resist the king of Assyria, Sennacherib (</w:t>
-      </w:r>
-      <w:hyperlink r:id="rId40">
-        <w:r>
-          <w:rPr>
-            <w:lang w:val="en_US" w:bidi="en_US"/>
-          </w:rPr>
-          <w:rPr>
-            <w:color w:val="0000EE"/>
-            <w:u w:val="single"/>
-          </w:rPr>
-          <w:t>2 Kings 18:1–19:37</w:t>
-        </w:r>
-      </w:hyperlink>
-      <w:r>
-        <w:rPr>
-          <w:lang w:val="en_US" w:bidi="en_US"/>
-        </w:rPr>
-        <w:t>). Confidence comes when people trust God will keep his promises and complete the work he started in their lives (</w:t>
-      </w:r>
-      <w:hyperlink r:id="rId41">
-        <w:r>
-          <w:rPr>
-            <w:lang w:val="en_US" w:bidi="en_US"/>
-          </w:rPr>
-          <w:rPr>
-            <w:color w:val="0000EE"/>
-            <w:u w:val="single"/>
-          </w:rPr>
-          <w:t>Philippians 1:6</w:t>
+        <w:t xml:space="preserve">Those who have faith in God through Jesus move into the new realm of life. God appointed Jesus Christ as a "second Adam" (see </w:t>
+      </w:r>
+      <w:hyperlink r:id="rId33">
+        <w:r>
+          <w:rPr>
+            <w:lang w:val="en_US" w:bidi="en_US"/>
+          </w:rPr>
+          <w:rPr>
+            <w:color w:val="0000EE"/>
+            <w:u w:val="single"/>
+          </w:rPr>
+          <w:t>5:14</w:t>
+        </w:r>
+      </w:hyperlink>
+      <w:r>
+        <w:rPr>
+          <w:lang w:val="en_US" w:bidi="en_US"/>
+        </w:rPr>
+        <w:t>). By obeying God and fulfilling his will, Jesus achieved a major victory over the realm of sin that Adam started (</w:t>
+      </w:r>
+      <w:hyperlink r:id="rId32">
+        <w:r>
+          <w:rPr>
+            <w:lang w:val="en_US" w:bidi="en_US"/>
+          </w:rPr>
+          <w:rPr>
+            <w:color w:val="0000EE"/>
+            <w:u w:val="single"/>
+          </w:rPr>
+          <w:t>5:18–19</w:t>
+        </w:r>
+      </w:hyperlink>
+      <w:r>
+        <w:rPr>
+          <w:lang w:val="en_US" w:bidi="en_US"/>
+        </w:rPr>
+        <w:t>). By accepting God's gift of grace, people choose Jesus as their leader and hope for eternal life (</w:t>
+      </w:r>
+      <w:hyperlink r:id="rId34">
+        <w:r>
+          <w:rPr>
+            <w:lang w:val="en_US" w:bidi="en_US"/>
+          </w:rPr>
+          <w:rPr>
+            <w:color w:val="0000EE"/>
+            <w:u w:val="single"/>
+          </w:rPr>
+          <w:t>5:17</w:t>
         </w:r>
       </w:hyperlink>
       <w:r>
@@ -1061,10 +1036,27 @@
       </w:r>
       <w:r>
         <w:rPr>
-          <w:u w:val="single"/>
-          <w:lang w:val="en_US" w:bidi="en_US"/>
-        </w:rPr>
-        <w:t>Passages for Further Study</w:t>
+          <w:lang w:val="en_US" w:bidi="en_US"/>
+        </w:rPr>
+        <w:t>People in the new realm unite with Christ and enjoy the benefits of this union. They have "died with Christ," been "buried with Christ," and their current new life with Christ is an introduction to the day they will "live with Him" forever (</w:t>
+      </w:r>
+      <w:hyperlink r:id="rId35">
+        <w:r>
+          <w:rPr>
+            <w:lang w:val="en_US" w:bidi="en_US"/>
+          </w:rPr>
+          <w:rPr>
+            <w:color w:val="0000EE"/>
+            <w:u w:val="single"/>
+          </w:rPr>
+          <w:t>Romans 6:3–11</w:t>
+        </w:r>
+      </w:hyperlink>
+      <w:r>
+        <w:rPr>
+          <w:lang w:val="en_US" w:bidi="en_US"/>
+        </w:rPr>
+        <w:t>).</w:t>
       </w:r>
     </w:p>
     <w:p>
@@ -1074,6 +1066,129 @@
           <w:lang w:val="en_US" w:bidi="en_US"/>
         </w:rPr>
       </w:r>
+      <w:r>
+        <w:rPr>
+          <w:u w:val="single"/>
+          <w:lang w:val="en_US" w:bidi="en_US"/>
+        </w:rPr>
+        <w:t>Passages for Further Study</w:t>
+      </w:r>
+    </w:p>
+    <w:p>
+      <w:pPr/>
+      <w:r>
+        <w:rPr>
+          <w:lang w:val="en_US" w:bidi="en_US"/>
+        </w:rPr>
+      </w:r>
+      <w:hyperlink r:id="rId36">
+        <w:r>
+          <w:rPr>
+            <w:lang w:val="en_US" w:bidi="en_US"/>
+          </w:rPr>
+          <w:rPr>
+            <w:color w:val="0000EE"/>
+            <w:u w:val="single"/>
+          </w:rPr>
+          <w:t>Psalms 2:1–10</w:t>
+        </w:r>
+      </w:hyperlink>
+      <w:r>
+        <w:rPr>
+          <w:lang w:val="en_US" w:bidi="en_US"/>
+        </w:rPr>
+        <w:t xml:space="preserve">; </w:t>
+      </w:r>
+      <w:hyperlink r:id="rId37">
+        <w:r>
+          <w:rPr>
+            <w:lang w:val="en_US" w:bidi="en_US"/>
+          </w:rPr>
+          <w:rPr>
+            <w:color w:val="0000EE"/>
+            <w:u w:val="single"/>
+          </w:rPr>
+          <w:t>110:2</w:t>
+        </w:r>
+      </w:hyperlink>
+      <w:r>
+        <w:rPr>
+          <w:lang w:val="en_US" w:bidi="en_US"/>
+        </w:rPr>
+        <w:t xml:space="preserve">; </w:t>
+      </w:r>
+      <w:hyperlink r:id="rId38">
+        <w:r>
+          <w:rPr>
+            <w:lang w:val="en_US" w:bidi="en_US"/>
+          </w:rPr>
+          <w:rPr>
+            <w:color w:val="0000EE"/>
+            <w:u w:val="single"/>
+          </w:rPr>
+          <w:t>145:13</w:t>
+        </w:r>
+      </w:hyperlink>
+      <w:r>
+        <w:rPr>
+          <w:lang w:val="en_US" w:bidi="en_US"/>
+        </w:rPr>
+        <w:t xml:space="preserve">; </w:t>
+      </w:r>
+      <w:hyperlink r:id="rId39">
+        <w:r>
+          <w:rPr>
+            <w:lang w:val="en_US" w:bidi="en_US"/>
+          </w:rPr>
+          <w:rPr>
+            <w:color w:val="0000EE"/>
+            <w:u w:val="single"/>
+          </w:rPr>
+          <w:t>Daniel 2:31–45</w:t>
+        </w:r>
+      </w:hyperlink>
+      <w:r>
+        <w:rPr>
+          <w:lang w:val="en_US" w:bidi="en_US"/>
+        </w:rPr>
+        <w:t xml:space="preserve">; </w:t>
+      </w:r>
+      <w:hyperlink r:id="rId40">
+        <w:r>
+          <w:rPr>
+            <w:lang w:val="en_US" w:bidi="en_US"/>
+          </w:rPr>
+          <w:rPr>
+            <w:color w:val="0000EE"/>
+            <w:u w:val="single"/>
+          </w:rPr>
+          <w:t>7:1–28</w:t>
+        </w:r>
+      </w:hyperlink>
+      <w:r>
+        <w:rPr>
+          <w:lang w:val="en_US" w:bidi="en_US"/>
+        </w:rPr>
+        <w:t xml:space="preserve">; </w:t>
+      </w:r>
+      <w:hyperlink r:id="rId41">
+        <w:r>
+          <w:rPr>
+            <w:lang w:val="en_US" w:bidi="en_US"/>
+          </w:rPr>
+          <w:rPr>
+            <w:color w:val="0000EE"/>
+            <w:u w:val="single"/>
+          </w:rPr>
+          <w:t>Matthew 3:2</w:t>
+        </w:r>
+      </w:hyperlink>
+      <w:r>
+        <w:rPr>
+          <w:lang w:val="en_US" w:bidi="en_US"/>
+        </w:rPr>
+        <w:t xml:space="preserve">; </w:t>
+      </w:r>
       <w:hyperlink r:id="rId42">
         <w:r>
           <w:rPr>
@@ -1083,7 +1198,7 @@
             <w:color w:val="0000EE"/>
             <w:u w:val="single"/>
           </w:rPr>
-          <w:t>Genesis 12:1–4</w:t>
+          <w:t>6:10</w:t>
         </w:r>
       </w:hyperlink>
       <w:r>
@@ -1101,7 +1216,7 @@
             <w:color w:val="0000EE"/>
             <w:u w:val="single"/>
           </w:rPr>
-          <w:t>Joshua 1:10–18</w:t>
+          <w:t>7:13</w:t>
         </w:r>
       </w:hyperlink>
       <w:r>
@@ -1110,16 +1225,16 @@
         </w:rPr>
         <w:t xml:space="preserve">; </w:t>
       </w:r>
-      <w:hyperlink r:id="rId38">
-        <w:r>
-          <w:rPr>
-            <w:lang w:val="en_US" w:bidi="en_US"/>
-          </w:rPr>
-          <w:rPr>
-            <w:color w:val="0000EE"/>
-            <w:u w:val="single"/>
-          </w:rPr>
-          <w:t>2:9–14</w:t>
+      <w:hyperlink r:id="rId44">
+        <w:r>
+          <w:rPr>
+            <w:lang w:val="en_US" w:bidi="en_US"/>
+          </w:rPr>
+          <w:rPr>
+            <w:color w:val="0000EE"/>
+            <w:u w:val="single"/>
+          </w:rPr>
+          <w:t>8:11–12</w:t>
         </w:r>
       </w:hyperlink>
       <w:r>
@@ -1128,16 +1243,16 @@
         </w:rPr>
         <w:t xml:space="preserve">; </w:t>
       </w:r>
-      <w:hyperlink r:id="rId40">
-        <w:r>
-          <w:rPr>
-            <w:lang w:val="en_US" w:bidi="en_US"/>
-          </w:rPr>
-          <w:rPr>
-            <w:color w:val="0000EE"/>
-            <w:u w:val="single"/>
-          </w:rPr>
-          <w:t>2 Kings 18:1–19:37</w:t>
+      <w:hyperlink r:id="rId45">
+        <w:r>
+          <w:rPr>
+            <w:lang w:val="en_US" w:bidi="en_US"/>
+          </w:rPr>
+          <w:rPr>
+            <w:color w:val="0000EE"/>
+            <w:u w:val="single"/>
+          </w:rPr>
+          <w:t>12:25–28</w:t>
         </w:r>
       </w:hyperlink>
       <w:r>
@@ -1146,16 +1261,160 @@
         </w:rPr>
         <w:t xml:space="preserve">; </w:t>
       </w:r>
-      <w:hyperlink r:id="rId35">
-        <w:r>
-          <w:rPr>
-            <w:lang w:val="en_US" w:bidi="en_US"/>
-          </w:rPr>
-          <w:rPr>
-            <w:color w:val="0000EE"/>
-            <w:u w:val="single"/>
-          </w:rPr>
-          <w:t>Nehemiah 1:8–9</w:t>
+      <w:hyperlink r:id="rId46">
+        <w:r>
+          <w:rPr>
+            <w:lang w:val="en_US" w:bidi="en_US"/>
+          </w:rPr>
+          <w:rPr>
+            <w:color w:val="0000EE"/>
+            <w:u w:val="single"/>
+          </w:rPr>
+          <w:t>13:44–52</w:t>
+        </w:r>
+      </w:hyperlink>
+      <w:r>
+        <w:rPr>
+          <w:lang w:val="en_US" w:bidi="en_US"/>
+        </w:rPr>
+        <w:t xml:space="preserve">; </w:t>
+      </w:r>
+      <w:hyperlink r:id="rId47">
+        <w:r>
+          <w:rPr>
+            <w:lang w:val="en_US" w:bidi="en_US"/>
+          </w:rPr>
+          <w:rPr>
+            <w:color w:val="0000EE"/>
+            <w:u w:val="single"/>
+          </w:rPr>
+          <w:t>20:25–28</w:t>
+        </w:r>
+      </w:hyperlink>
+      <w:r>
+        <w:rPr>
+          <w:lang w:val="en_US" w:bidi="en_US"/>
+        </w:rPr>
+        <w:t xml:space="preserve">; </w:t>
+      </w:r>
+      <w:hyperlink r:id="rId48">
+        <w:r>
+          <w:rPr>
+            <w:lang w:val="en_US" w:bidi="en_US"/>
+          </w:rPr>
+          <w:rPr>
+            <w:color w:val="0000EE"/>
+            <w:u w:val="single"/>
+          </w:rPr>
+          <w:t>John 18:36</w:t>
+        </w:r>
+      </w:hyperlink>
+      <w:r>
+        <w:rPr>
+          <w:lang w:val="en_US" w:bidi="en_US"/>
+        </w:rPr>
+        <w:t xml:space="preserve">; </w:t>
+      </w:r>
+      <w:hyperlink r:id="rId49">
+        <w:r>
+          <w:rPr>
+            <w:lang w:val="en_US" w:bidi="en_US"/>
+          </w:rPr>
+          <w:rPr>
+            <w:color w:val="0000EE"/>
+            <w:u w:val="single"/>
+          </w:rPr>
+          <w:t>Romans 5:12–8:39</w:t>
+        </w:r>
+      </w:hyperlink>
+      <w:r>
+        <w:rPr>
+          <w:lang w:val="en_US" w:bidi="en_US"/>
+        </w:rPr>
+        <w:t xml:space="preserve">; </w:t>
+      </w:r>
+      <w:hyperlink r:id="rId50">
+        <w:r>
+          <w:rPr>
+            <w:lang w:val="en_US" w:bidi="en_US"/>
+          </w:rPr>
+          <w:rPr>
+            <w:color w:val="0000EE"/>
+            <w:u w:val="single"/>
+          </w:rPr>
+          <w:t>14:17</w:t>
+        </w:r>
+      </w:hyperlink>
+      <w:r>
+        <w:rPr>
+          <w:lang w:val="en_US" w:bidi="en_US"/>
+        </w:rPr>
+        <w:t xml:space="preserve">; </w:t>
+      </w:r>
+      <w:hyperlink r:id="rId51">
+        <w:r>
+          <w:rPr>
+            <w:lang w:val="en_US" w:bidi="en_US"/>
+          </w:rPr>
+          <w:rPr>
+            <w:color w:val="0000EE"/>
+            <w:u w:val="single"/>
+          </w:rPr>
+          <w:t>1 Corinthians 6:9–11</w:t>
+        </w:r>
+      </w:hyperlink>
+      <w:r>
+        <w:rPr>
+          <w:lang w:val="en_US" w:bidi="en_US"/>
+        </w:rPr>
+        <w:t xml:space="preserve">; </w:t>
+      </w:r>
+      <w:hyperlink r:id="rId52">
+        <w:r>
+          <w:rPr>
+            <w:lang w:val="en_US" w:bidi="en_US"/>
+          </w:rPr>
+          <w:rPr>
+            <w:color w:val="0000EE"/>
+            <w:u w:val="single"/>
+          </w:rPr>
+          <w:t>15:20–28</w:t>
+        </w:r>
+      </w:hyperlink>
+      <w:r>
+        <w:rPr>
+          <w:lang w:val="en_US" w:bidi="en_US"/>
+        </w:rPr>
+        <w:t xml:space="preserve">; </w:t>
+      </w:r>
+      <w:hyperlink r:id="rId53">
+        <w:r>
+          <w:rPr>
+            <w:lang w:val="en_US" w:bidi="en_US"/>
+          </w:rPr>
+          <w:rPr>
+            <w:color w:val="0000EE"/>
+            <w:u w:val="single"/>
+          </w:rPr>
+          <w:t>Galatians 5:16–26</w:t>
+        </w:r>
+      </w:hyperlink>
+      <w:r>
+        <w:rPr>
+          <w:lang w:val="en_US" w:bidi="en_US"/>
+        </w:rPr>
+        <w:t xml:space="preserve">; </w:t>
+      </w:r>
+      <w:hyperlink r:id="rId54">
+        <w:r>
+          <w:rPr>
+            <w:lang w:val="en_US" w:bidi="en_US"/>
+          </w:rPr>
+          <w:rPr>
+            <w:color w:val="0000EE"/>
+            <w:u w:val="single"/>
+          </w:rPr>
+          <w:t>Ephesians 1:3</w:t>
         </w:r>
       </w:hyperlink>
       <w:r>
@@ -1164,16 +1423,16 @@
         </w:rPr>
         <w:t xml:space="preserve">, </w:t>
       </w:r>
-      <w:hyperlink r:id="rId21">
-        <w:r>
-          <w:rPr>
-            <w:lang w:val="en_US" w:bidi="en_US"/>
-          </w:rPr>
-          <w:rPr>
-            <w:color w:val="0000EE"/>
-            <w:u w:val="single"/>
-          </w:rPr>
-          <w:t>11</w:t>
+      <w:hyperlink r:id="rId55">
+        <w:r>
+          <w:rPr>
+            <w:lang w:val="en_US" w:bidi="en_US"/>
+          </w:rPr>
+          <w:rPr>
+            <w:color w:val="0000EE"/>
+            <w:u w:val="single"/>
+          </w:rPr>
+          <w:t>20</w:t>
         </w:r>
       </w:hyperlink>
       <w:r>
@@ -1182,16 +1441,561 @@
         </w:rPr>
         <w:t xml:space="preserve">; </w:t>
       </w:r>
-      <w:hyperlink r:id="rId22">
-        <w:r>
-          <w:rPr>
-            <w:lang w:val="en_US" w:bidi="en_US"/>
-          </w:rPr>
-          <w:rPr>
-            <w:color w:val="0000EE"/>
-            <w:u w:val="single"/>
-          </w:rPr>
-          <w:t>2:8</w:t>
+      <w:hyperlink r:id="rId56">
+        <w:r>
+          <w:rPr>
+            <w:lang w:val="en_US" w:bidi="en_US"/>
+          </w:rPr>
+          <w:rPr>
+            <w:color w:val="0000EE"/>
+            <w:u w:val="single"/>
+          </w:rPr>
+          <w:t>2:6</w:t>
+        </w:r>
+      </w:hyperlink>
+      <w:r>
+        <w:rPr>
+          <w:lang w:val="en_US" w:bidi="en_US"/>
+        </w:rPr>
+        <w:t xml:space="preserve">; </w:t>
+      </w:r>
+      <w:hyperlink r:id="rId57">
+        <w:r>
+          <w:rPr>
+            <w:lang w:val="en_US" w:bidi="en_US"/>
+          </w:rPr>
+          <w:rPr>
+            <w:color w:val="0000EE"/>
+            <w:u w:val="single"/>
+          </w:rPr>
+          <w:t>5:1–20</w:t>
+        </w:r>
+      </w:hyperlink>
+      <w:r>
+        <w:rPr>
+          <w:lang w:val="en_US" w:bidi="en_US"/>
+        </w:rPr>
+        <w:t xml:space="preserve">; </w:t>
+      </w:r>
+      <w:hyperlink r:id="rId58">
+        <w:r>
+          <w:rPr>
+            <w:lang w:val="en_US" w:bidi="en_US"/>
+          </w:rPr>
+          <w:rPr>
+            <w:color w:val="0000EE"/>
+            <w:u w:val="single"/>
+          </w:rPr>
+          <w:t>Colossians 1:13–14</w:t>
+        </w:r>
+      </w:hyperlink>
+      <w:r>
+        <w:rPr>
+          <w:lang w:val="en_US" w:bidi="en_US"/>
+        </w:rPr>
+        <w:t xml:space="preserve">; </w:t>
+      </w:r>
+      <w:hyperlink r:id="rId59">
+        <w:r>
+          <w:rPr>
+            <w:lang w:val="en_US" w:bidi="en_US"/>
+          </w:rPr>
+          <w:rPr>
+            <w:color w:val="0000EE"/>
+            <w:u w:val="single"/>
+          </w:rPr>
+          <w:t>Hebrews 6:4–5</w:t>
+        </w:r>
+      </w:hyperlink>
+      <w:r>
+        <w:rPr>
+          <w:lang w:val="en_US" w:bidi="en_US"/>
+        </w:rPr>
+        <w:t xml:space="preserve">; </w:t>
+      </w:r>
+      <w:hyperlink r:id="rId60">
+        <w:r>
+          <w:rPr>
+            <w:lang w:val="en_US" w:bidi="en_US"/>
+          </w:rPr>
+          <w:rPr>
+            <w:color w:val="0000EE"/>
+            <w:u w:val="single"/>
+          </w:rPr>
+          <w:t>12:18–29</w:t>
+        </w:r>
+      </w:hyperlink>
+      <w:r>
+        <w:rPr>
+          <w:lang w:val="en_US" w:bidi="en_US"/>
+        </w:rPr>
+        <w:t xml:space="preserve">; </w:t>
+      </w:r>
+      <w:hyperlink r:id="rId61">
+        <w:r>
+          <w:rPr>
+            <w:lang w:val="en_US" w:bidi="en_US"/>
+          </w:rPr>
+          <w:rPr>
+            <w:color w:val="0000EE"/>
+            <w:u w:val="single"/>
+          </w:rPr>
+          <w:t>Revelation 11:15</w:t>
+        </w:r>
+      </w:hyperlink>
+      <w:r>
+        <w:rPr>
+          <w:lang w:val="en_US" w:bidi="en_US"/>
+        </w:rPr>
+        <w:t xml:space="preserve">; </w:t>
+      </w:r>
+      <w:hyperlink r:id="rId62">
+        <w:r>
+          <w:rPr>
+            <w:lang w:val="en_US" w:bidi="en_US"/>
+          </w:rPr>
+          <w:rPr>
+            <w:color w:val="0000EE"/>
+            <w:u w:val="single"/>
+          </w:rPr>
+          <w:t>12:10</w:t>
+        </w:r>
+      </w:hyperlink>
+      <w:r>
+        <w:rPr>
+          <w:lang w:val="en_US" w:bidi="en_US"/>
+        </w:rPr>
+      </w:r>
+      <w:r>
+        <w:rPr>
+          <w:lang w:val="en_US" w:bidi="en_US"/>
+        </w:rPr>
+      </w:r>
+    </w:p>
+    <w:p>
+      <w:pPr/>
+      <w:r>
+        <w:rPr>
+          <w:lang w:val="en_US" w:bidi="en_US"/>
+        </w:rPr>
+      </w:r>
+    </w:p>
+    <w:p>
+      <w:pPr>
+        <w:pStyle w:val="Heading2"/>
+      </w:pPr>
+      <w:r>
+        <w:rPr>
+          <w:lang w:val="en_US" w:bidi="en_US"/>
+        </w:rPr>
+        <w:t>Oppression of God’s People</w:t>
+      </w:r>
+      <w:r>
+        <w:rPr>
+          <w:lang w:val="en_US" w:bidi="en_US"/>
+        </w:rPr>
+      </w:r>
+    </w:p>
+    <w:p>
+      <w:pPr/>
+      <w:r>
+        <w:rPr>
+          <w:lang w:val="en_US" w:bidi="en_US"/>
+        </w:rPr>
+      </w:r>
+      <w:r>
+        <w:rPr>
+          <w:lang w:val="en_US" w:bidi="en_US"/>
+        </w:rPr>
+        <w:t xml:space="preserve">God does not want his people to suffer under oppression. From the time when God freed the Israelites from slavery in Egypt under Moses (the exodus), to when Joshua led them to conquer the promised land, and through David's battles, God's goal for Israel was complete victory over their enemies (see </w:t>
+      </w:r>
+      <w:hyperlink r:id="rId63">
+        <w:r>
+          <w:rPr>
+            <w:lang w:val="en_US" w:bidi="en_US"/>
+          </w:rPr>
+          <w:rPr>
+            <w:color w:val="0000EE"/>
+            <w:u w:val="single"/>
+          </w:rPr>
+          <w:t>Joshua 1:1–9</w:t>
+        </w:r>
+      </w:hyperlink>
+      <w:r>
+        <w:rPr>
+          <w:lang w:val="en_US" w:bidi="en_US"/>
+        </w:rPr>
+        <w:t>). In a similar way, the New Testament often speaks of freedom from the oppression or control of sin as an essential blessing of a relationship with Jesus (</w:t>
+      </w:r>
+      <w:hyperlink r:id="rId64">
+        <w:r>
+          <w:rPr>
+            <w:lang w:val="en_US" w:bidi="en_US"/>
+          </w:rPr>
+          <w:rPr>
+            <w:color w:val="0000EE"/>
+            <w:u w:val="single"/>
+          </w:rPr>
+          <w:t>Romans 6:1–14</w:t>
+        </w:r>
+      </w:hyperlink>
+      <w:r>
+        <w:rPr>
+          <w:lang w:val="en_US" w:bidi="en_US"/>
+        </w:rPr>
+        <w:t xml:space="preserve">; </w:t>
+      </w:r>
+      <w:hyperlink r:id="rId65">
+        <w:r>
+          <w:rPr>
+            <w:lang w:val="en_US" w:bidi="en_US"/>
+          </w:rPr>
+          <w:rPr>
+            <w:color w:val="0000EE"/>
+            <w:u w:val="single"/>
+          </w:rPr>
+          <w:t>Galatians 5:1–15</w:t>
+        </w:r>
+      </w:hyperlink>
+      <w:r>
+        <w:rPr>
+          <w:lang w:val="en_US" w:bidi="en_US"/>
+        </w:rPr>
+        <w:t>).</w:t>
+      </w:r>
+    </w:p>
+    <w:p>
+      <w:pPr/>
+      <w:r>
+        <w:rPr>
+          <w:lang w:val="en_US" w:bidi="en_US"/>
+        </w:rPr>
+      </w:r>
+      <w:r>
+        <w:rPr>
+          <w:lang w:val="en_US" w:bidi="en_US"/>
+        </w:rPr>
+        <w:t>Why does oppression exist? The book of Judges suggests it is because of human disobedience. If Israel obeyed God he promised victory in the conquest. Yet, at best they only partially obeyed him (</w:t>
+      </w:r>
+      <w:hyperlink r:id="rId66">
+        <w:r>
+          <w:rPr>
+            <w:lang w:val="en_US" w:bidi="en_US"/>
+          </w:rPr>
+          <w:rPr>
+            <w:color w:val="0000EE"/>
+            <w:u w:val="single"/>
+          </w:rPr>
+          <w:t>Judges 1:19–36</w:t>
+        </w:r>
+      </w:hyperlink>
+      <w:r>
+        <w:rPr>
+          <w:lang w:val="en_US" w:bidi="en_US"/>
+        </w:rPr>
+        <w:t>). With the rewards of victory available, why did God's past people fail as well as the church today?</w:t>
+      </w:r>
+    </w:p>
+    <w:p>
+      <w:pPr/>
+      <w:r>
+        <w:rPr>
+          <w:lang w:val="en_US" w:bidi="en_US"/>
+        </w:rPr>
+      </w:r>
+      <w:r>
+        <w:rPr>
+          <w:lang w:val="en_US" w:bidi="en_US"/>
+        </w:rPr>
+        <w:t>In Judges, a new generation grew up that did not participate in the exodus from Egypt or Joshua's conquest of Canaan. Their faith relied on stories of divine acts from the past. They had not personally witnessed "</w:t>
+      </w:r>
+      <w:r>
+        <w:rPr>
+          <w:lang w:val="en_US" w:bidi="en_US"/>
+        </w:rPr>
+        <w:t>all the great works that the LORD had done for Israel"</w:t>
+      </w:r>
+      <w:r>
+        <w:rPr>
+          <w:lang w:val="en_US" w:bidi="en_US"/>
+        </w:rPr>
+        <w:t xml:space="preserve"> (</w:t>
+      </w:r>
+      <w:hyperlink r:id="rId67">
+        <w:r>
+          <w:rPr>
+            <w:lang w:val="en_US" w:bidi="en_US"/>
+          </w:rPr>
+          <w:rPr>
+            <w:color w:val="0000EE"/>
+            <w:u w:val="single"/>
+          </w:rPr>
+          <w:t>Judges 2:7</w:t>
+        </w:r>
+      </w:hyperlink>
+      <w:r>
+        <w:rPr>
+          <w:lang w:val="en_US" w:bidi="en_US"/>
+        </w:rPr>
+        <w:t>). This generation "</w:t>
+      </w:r>
+      <w:r>
+        <w:rPr>
+          <w:lang w:val="en_US" w:bidi="en_US"/>
+        </w:rPr>
+        <w:t>did not know the LORD or the works that He had done for Israel"</w:t>
+      </w:r>
+      <w:r>
+        <w:rPr>
+          <w:lang w:val="en_US" w:bidi="en_US"/>
+        </w:rPr>
+        <w:t xml:space="preserve"> (</w:t>
+      </w:r>
+      <w:hyperlink r:id="rId68">
+        <w:r>
+          <w:rPr>
+            <w:lang w:val="en_US" w:bidi="en_US"/>
+          </w:rPr>
+          <w:rPr>
+            <w:color w:val="0000EE"/>
+            <w:u w:val="single"/>
+          </w:rPr>
+          <w:t>2:10</w:t>
+        </w:r>
+      </w:hyperlink>
+      <w:r>
+        <w:rPr>
+          <w:lang w:val="en_US" w:bidi="en_US"/>
+        </w:rPr>
+        <w:t xml:space="preserve">). </w:t>
+      </w:r>
+    </w:p>
+    <w:p>
+      <w:pPr/>
+      <w:r>
+        <w:rPr>
+          <w:lang w:val="en_US" w:bidi="en_US"/>
+        </w:rPr>
+      </w:r>
+      <w:r>
+        <w:rPr>
+          <w:lang w:val="en_US" w:bidi="en_US"/>
+        </w:rPr>
+        <w:t>God allowed enemies to remain in the land "to test all the Israelites" (</w:t>
+      </w:r>
+      <w:hyperlink r:id="rId69">
+        <w:r>
+          <w:rPr>
+            <w:lang w:val="en_US" w:bidi="en_US"/>
+          </w:rPr>
+          <w:rPr>
+            <w:color w:val="0000EE"/>
+            <w:u w:val="single"/>
+          </w:rPr>
+          <w:t>3:1–4</w:t>
+        </w:r>
+      </w:hyperlink>
+      <w:r>
+        <w:rPr>
+          <w:lang w:val="en_US" w:bidi="en_US"/>
+        </w:rPr>
+        <w:t>). But Israel did not expel these enemies as God commanded. The rest of the book of Judges shows the tragic results of that failure.</w:t>
+      </w:r>
+    </w:p>
+    <w:p>
+      <w:pPr/>
+      <w:r>
+        <w:rPr>
+          <w:lang w:val="en_US" w:bidi="en_US"/>
+        </w:rPr>
+      </w:r>
+      <w:r>
+        <w:rPr>
+          <w:lang w:val="en_US" w:bidi="en_US"/>
+        </w:rPr>
+        <w:t>God allows his people to experience the consequences of turning away from him (</w:t>
+      </w:r>
+      <w:hyperlink r:id="rId70">
+        <w:r>
+          <w:rPr>
+            <w:lang w:val="en_US" w:bidi="en_US"/>
+          </w:rPr>
+          <w:rPr>
+            <w:color w:val="0000EE"/>
+            <w:u w:val="single"/>
+          </w:rPr>
+          <w:t>Judges 2:12–14</w:t>
+        </w:r>
+      </w:hyperlink>
+      <w:r>
+        <w:rPr>
+          <w:lang w:val="en_US" w:bidi="en_US"/>
+        </w:rPr>
+        <w:t xml:space="preserve">). But God remains faithful and does not ultimately abandon those who truly worship him. Even in judgment, God punishes for good. He teaches his people obedience. </w:t>
+      </w:r>
+    </w:p>
+    <w:p>
+      <w:pPr/>
+      <w:r>
+        <w:rPr>
+          <w:lang w:val="en_US" w:bidi="en_US"/>
+        </w:rPr>
+      </w:r>
+      <w:r>
+        <w:rPr>
+          <w:lang w:val="en_US" w:bidi="en_US"/>
+        </w:rPr>
+        <w:t>The enemies who took Israel's blessings became part of God's test of Israel's faithfulness. We can learn from oppression, as both physical and spiritual battles need discipline. This experience can lead to a "</w:t>
+      </w:r>
+      <w:r>
+        <w:rPr>
+          <w:lang w:val="en_US" w:bidi="en_US"/>
+        </w:rPr>
+        <w:t>a harvest of righteousness and peace</w:t>
+      </w:r>
+      <w:r>
+        <w:rPr>
+          <w:lang w:val="en_US" w:bidi="en_US"/>
+        </w:rPr>
+        <w:t xml:space="preserve">" (see </w:t>
+      </w:r>
+      <w:hyperlink r:id="rId71">
+        <w:r>
+          <w:rPr>
+            <w:lang w:val="en_US" w:bidi="en_US"/>
+          </w:rPr>
+          <w:rPr>
+            <w:color w:val="0000EE"/>
+            <w:u w:val="single"/>
+          </w:rPr>
+          <w:t>Hebrews 12:5–11</w:t>
+        </w:r>
+      </w:hyperlink>
+      <w:r>
+        <w:rPr>
+          <w:lang w:val="en_US" w:bidi="en_US"/>
+        </w:rPr>
+        <w:t>).</w:t>
+      </w:r>
+    </w:p>
+    <w:p>
+      <w:pPr/>
+      <w:r>
+        <w:rPr>
+          <w:lang w:val="en_US" w:bidi="en_US"/>
+        </w:rPr>
+      </w:r>
+      <w:r>
+        <w:rPr>
+          <w:lang w:val="en_US" w:bidi="en_US"/>
+        </w:rPr>
+        <w:t>Through Jesus Christ, God provided undeserved salvation from the worldwide oppression of sin, “while we were still sinners” (</w:t>
+      </w:r>
+      <w:hyperlink r:id="rId72">
+        <w:r>
+          <w:rPr>
+            <w:lang w:val="en_US" w:bidi="en_US"/>
+          </w:rPr>
+          <w:rPr>
+            <w:color w:val="0000EE"/>
+            <w:u w:val="single"/>
+          </w:rPr>
+          <w:t>Romans 5:8</w:t>
+        </w:r>
+      </w:hyperlink>
+      <w:r>
+        <w:rPr>
+          <w:lang w:val="en_US" w:bidi="en_US"/>
+        </w:rPr>
+        <w:t>). The Israelites experienced salvation from their enemies when they turned in repentance to the Lord. So, we can experience salvation from the greatest oppressive force when we turn to God in repentance.</w:t>
+      </w:r>
+    </w:p>
+    <w:p>
+      <w:pPr/>
+      <w:r>
+        <w:rPr>
+          <w:lang w:val="en_US" w:bidi="en_US"/>
+        </w:rPr>
+      </w:r>
+      <w:r>
+        <w:rPr>
+          <w:u w:val="single"/>
+          <w:lang w:val="en_US" w:bidi="en_US"/>
+        </w:rPr>
+        <w:t>Passages for Further Study</w:t>
+      </w:r>
+    </w:p>
+    <w:p>
+      <w:pPr/>
+      <w:r>
+        <w:rPr>
+          <w:lang w:val="en_US" w:bidi="en_US"/>
+        </w:rPr>
+      </w:r>
+      <w:hyperlink r:id="rId73">
+        <w:r>
+          <w:rPr>
+            <w:lang w:val="en_US" w:bidi="en_US"/>
+          </w:rPr>
+          <w:rPr>
+            <w:color w:val="0000EE"/>
+            <w:u w:val="single"/>
+          </w:rPr>
+          <w:t>Leviticus 26:14–39</w:t>
+        </w:r>
+      </w:hyperlink>
+      <w:r>
+        <w:rPr>
+          <w:lang w:val="en_US" w:bidi="en_US"/>
+        </w:rPr>
+        <w:t xml:space="preserve">; </w:t>
+      </w:r>
+      <w:hyperlink r:id="rId74">
+        <w:r>
+          <w:rPr>
+            <w:lang w:val="en_US" w:bidi="en_US"/>
+          </w:rPr>
+          <w:rPr>
+            <w:color w:val="0000EE"/>
+            <w:u w:val="single"/>
+          </w:rPr>
+          <w:t>Deuteronomy 8:19–20</w:t>
+        </w:r>
+      </w:hyperlink>
+      <w:r>
+        <w:rPr>
+          <w:lang w:val="en_US" w:bidi="en_US"/>
+        </w:rPr>
+        <w:t xml:space="preserve">; </w:t>
+      </w:r>
+      <w:hyperlink r:id="rId75">
+        <w:r>
+          <w:rPr>
+            <w:lang w:val="en_US" w:bidi="en_US"/>
+          </w:rPr>
+          <w:rPr>
+            <w:color w:val="0000EE"/>
+            <w:u w:val="single"/>
+          </w:rPr>
+          <w:t>28:15–68</w:t>
+        </w:r>
+      </w:hyperlink>
+      <w:r>
+        <w:rPr>
+          <w:lang w:val="en_US" w:bidi="en_US"/>
+        </w:rPr>
+        <w:t xml:space="preserve">; </w:t>
+      </w:r>
+      <w:hyperlink r:id="rId76">
+        <w:r>
+          <w:rPr>
+            <w:lang w:val="en_US" w:bidi="en_US"/>
+          </w:rPr>
+          <w:rPr>
+            <w:color w:val="0000EE"/>
+            <w:u w:val="single"/>
+          </w:rPr>
+          <w:t>Judges 2:2–3</w:t>
         </w:r>
       </w:hyperlink>
       <w:r>
@@ -1200,7 +2004,25 @@
         </w:rPr>
         <w:t xml:space="preserve">, </w:t>
       </w:r>
-      <w:hyperlink r:id="rId23">
+      <w:hyperlink r:id="rId77">
+        <w:r>
+          <w:rPr>
+            <w:lang w:val="en_US" w:bidi="en_US"/>
+          </w:rPr>
+          <w:rPr>
+            <w:color w:val="0000EE"/>
+            <w:u w:val="single"/>
+          </w:rPr>
+          <w:t>10–15</w:t>
+        </w:r>
+      </w:hyperlink>
+      <w:r>
+        <w:rPr>
+          <w:lang w:val="en_US" w:bidi="en_US"/>
+        </w:rPr>
+        <w:t>,</w:t>
+      </w:r>
+      <w:hyperlink r:id="rId78">
         <w:r>
           <w:rPr>
             <w:lang w:val="en_US" w:bidi="en_US"/>
@@ -1216,18 +2038,181 @@
         <w:rPr>
           <w:lang w:val="en_US" w:bidi="en_US"/>
         </w:rPr>
+        <w:t xml:space="preserve">; </w:t>
+      </w:r>
+      <w:hyperlink r:id="rId79">
+        <w:r>
+          <w:rPr>
+            <w:lang w:val="en_US" w:bidi="en_US"/>
+          </w:rPr>
+          <w:rPr>
+            <w:color w:val="0000EE"/>
+            <w:u w:val="single"/>
+          </w:rPr>
+          <w:t>3:1–8</w:t>
+        </w:r>
+      </w:hyperlink>
+      <w:r>
+        <w:rPr>
+          <w:lang w:val="en_US" w:bidi="en_US"/>
+        </w:rPr>
+        <w:t xml:space="preserve">; </w:t>
+      </w:r>
+      <w:hyperlink r:id="rId80">
+        <w:r>
+          <w:rPr>
+            <w:lang w:val="en_US" w:bidi="en_US"/>
+          </w:rPr>
+          <w:rPr>
+            <w:color w:val="0000EE"/>
+            <w:u w:val="single"/>
+          </w:rPr>
+          <w:t>2 Kings 17:5–23</w:t>
+        </w:r>
+      </w:hyperlink>
+      <w:r>
+        <w:rPr>
+          <w:lang w:val="en_US" w:bidi="en_US"/>
+        </w:rPr>
+        <w:t xml:space="preserve">; </w:t>
+      </w:r>
+      <w:hyperlink r:id="rId81">
+        <w:r>
+          <w:rPr>
+            <w:lang w:val="en_US" w:bidi="en_US"/>
+          </w:rPr>
+          <w:rPr>
+            <w:color w:val="0000EE"/>
+            <w:u w:val="single"/>
+          </w:rPr>
+          <w:t>Ezekiel 22:27–29</w:t>
+        </w:r>
+      </w:hyperlink>
+      <w:r>
+        <w:rPr>
+          <w:lang w:val="en_US" w:bidi="en_US"/>
+        </w:rPr>
+        <w:t xml:space="preserve">; </w:t>
+      </w:r>
+      <w:hyperlink r:id="rId82">
+        <w:r>
+          <w:rPr>
+            <w:lang w:val="en_US" w:bidi="en_US"/>
+          </w:rPr>
+          <w:rPr>
+            <w:color w:val="0000EE"/>
+            <w:u w:val="single"/>
+          </w:rPr>
+          <w:t>Amos 4:1</w:t>
+        </w:r>
+      </w:hyperlink>
+      <w:r>
+        <w:rPr>
+          <w:lang w:val="en_US" w:bidi="en_US"/>
+        </w:rPr>
+        <w:t xml:space="preserve">; </w:t>
+      </w:r>
+      <w:hyperlink r:id="rId83">
+        <w:r>
+          <w:rPr>
+            <w:lang w:val="en_US" w:bidi="en_US"/>
+          </w:rPr>
+          <w:rPr>
+            <w:color w:val="0000EE"/>
+            <w:u w:val="single"/>
+          </w:rPr>
+          <w:t>James 2:1–7</w:t>
+        </w:r>
+      </w:hyperlink>
+      <w:r>
+        <w:rPr>
+          <w:lang w:val="en_US" w:bidi="en_US"/>
+        </w:rPr>
+      </w:r>
+      <w:r>
+        <w:rPr>
+          <w:lang w:val="en_US" w:bidi="en_US"/>
+        </w:rPr>
+      </w:r>
+    </w:p>
+    <w:p>
+      <w:pPr/>
+      <w:r>
+        <w:rPr>
+          <w:lang w:val="en_US" w:bidi="en_US"/>
+        </w:rPr>
+      </w:r>
+    </w:p>
+    <w:p>
+      <w:pPr>
+        <w:pStyle w:val="Heading2"/>
+      </w:pPr>
+      <w:r>
+        <w:rPr>
+          <w:lang w:val="en_US" w:bidi="en_US"/>
+        </w:rPr>
+        <w:t>Our Advocate</w:t>
+      </w:r>
+      <w:r>
+        <w:rPr>
+          <w:lang w:val="en_US" w:bidi="en_US"/>
+        </w:rPr>
+      </w:r>
+    </w:p>
+    <w:p>
+      <w:pPr/>
+      <w:r>
+        <w:rPr>
+          <w:lang w:val="en_US" w:bidi="en_US"/>
+        </w:rPr>
+      </w:r>
+      <w:r>
+        <w:rPr>
+          <w:lang w:val="en_US" w:bidi="en_US"/>
+        </w:rPr>
+        <w:t xml:space="preserve">In the Gospel of John, the Greek word </w:t>
+      </w:r>
+      <w:r>
+        <w:rPr>
+          <w:i/>
+          <w:lang w:val="en_US" w:bidi="en_US"/>
+        </w:rPr>
+        <w:t xml:space="preserve">paraklētos </w:t>
+      </w:r>
+      <w:r>
+        <w:rPr>
+          <w:lang w:val="en_US" w:bidi="en_US"/>
+        </w:rPr>
+        <w:t>refers to the Holy Spirit. This word literally means "called alongside" and describes him as "Advocate" (</w:t>
+      </w:r>
+      <w:hyperlink r:id="rId84">
+        <w:r>
+          <w:rPr>
+            <w:lang w:val="en_US" w:bidi="en_US"/>
+          </w:rPr>
+          <w:rPr>
+            <w:color w:val="0000EE"/>
+            <w:u w:val="single"/>
+          </w:rPr>
+          <w:t>John 14:16</w:t>
+        </w:r>
+      </w:hyperlink>
+      <w:r>
+        <w:rPr>
+          <w:lang w:val="en_US" w:bidi="en_US"/>
+        </w:rPr>
         <w:t xml:space="preserve">, </w:t>
       </w:r>
-      <w:hyperlink r:id="rId44">
-        <w:r>
-          <w:rPr>
-            <w:lang w:val="en_US" w:bidi="en_US"/>
-          </w:rPr>
-          <w:rPr>
-            <w:color w:val="0000EE"/>
-            <w:u w:val="single"/>
-          </w:rPr>
-          <w:t>20</w:t>
+      <w:hyperlink r:id="rId85">
+        <w:r>
+          <w:rPr>
+            <w:lang w:val="en_US" w:bidi="en_US"/>
+          </w:rPr>
+          <w:rPr>
+            <w:color w:val="0000EE"/>
+            <w:u w:val="single"/>
+          </w:rPr>
+          <w:t>26</w:t>
         </w:r>
       </w:hyperlink>
       <w:r>
@@ -1236,16 +2221,168 @@
         </w:rPr>
         <w:t xml:space="preserve">; </w:t>
       </w:r>
-      <w:hyperlink r:id="rId24">
-        <w:r>
-          <w:rPr>
-            <w:lang w:val="en_US" w:bidi="en_US"/>
-          </w:rPr>
-          <w:rPr>
-            <w:color w:val="0000EE"/>
-            <w:u w:val="single"/>
-          </w:rPr>
-          <w:t>4:4–5</w:t>
+      <w:hyperlink r:id="rId86">
+        <w:r>
+          <w:rPr>
+            <w:lang w:val="en_US" w:bidi="en_US"/>
+          </w:rPr>
+          <w:rPr>
+            <w:color w:val="0000EE"/>
+            <w:u w:val="single"/>
+          </w:rPr>
+          <w:t>15:26</w:t>
+        </w:r>
+      </w:hyperlink>
+      <w:r>
+        <w:rPr>
+          <w:lang w:val="en_US" w:bidi="en_US"/>
+        </w:rPr>
+        <w:t xml:space="preserve">; </w:t>
+      </w:r>
+      <w:hyperlink r:id="rId87">
+        <w:r>
+          <w:rPr>
+            <w:lang w:val="en_US" w:bidi="en_US"/>
+          </w:rPr>
+          <w:rPr>
+            <w:color w:val="0000EE"/>
+            <w:u w:val="single"/>
+          </w:rPr>
+          <w:t>16:7</w:t>
+        </w:r>
+      </w:hyperlink>
+      <w:r>
+        <w:rPr>
+          <w:lang w:val="en_US" w:bidi="en_US"/>
+        </w:rPr>
+        <w:t xml:space="preserve">). This term appears in other Greek texts, where it refers to a legal advocate. This is someone who speaks in a person's defense in court and gives legal advice. </w:t>
+      </w:r>
+    </w:p>
+    <w:p>
+      <w:pPr/>
+      <w:r>
+        <w:rPr>
+          <w:lang w:val="en_US" w:bidi="en_US"/>
+        </w:rPr>
+      </w:r>
+      <w:r>
+        <w:rPr>
+          <w:lang w:val="en_US" w:bidi="en_US"/>
+        </w:rPr>
+        <w:t xml:space="preserve">"Counselor" is a common translation, but its modern meaning related to psychology can be misleading. The older legal sense of a lawyer giving advice is more accurate. </w:t>
+      </w:r>
+    </w:p>
+    <w:p>
+      <w:pPr/>
+      <w:r>
+        <w:rPr>
+          <w:lang w:val="en_US" w:bidi="en_US"/>
+        </w:rPr>
+      </w:r>
+      <w:r>
+        <w:rPr>
+          <w:lang w:val="en_US" w:bidi="en_US"/>
+        </w:rPr>
+        <w:t xml:space="preserve">"Comforter" is another common translation, but it can also be misleading. The older English meaning of someone who strengthens, or an "encourager," aligns better with the New Testament idea of </w:t>
+      </w:r>
+      <w:r>
+        <w:rPr>
+          <w:i/>
+          <w:lang w:val="en_US" w:bidi="en_US"/>
+        </w:rPr>
+        <w:t>paraklētos.</w:t>
+      </w:r>
+    </w:p>
+    <w:p>
+      <w:pPr/>
+      <w:r>
+        <w:rPr>
+          <w:lang w:val="en_US" w:bidi="en_US"/>
+        </w:rPr>
+      </w:r>
+      <w:r>
+        <w:rPr>
+          <w:lang w:val="en_US" w:bidi="en_US"/>
+        </w:rPr>
+        <w:t xml:space="preserve">Jesus described the Spirit as </w:t>
+      </w:r>
+      <w:r>
+        <w:rPr>
+          <w:i/>
+          <w:lang w:val="en_US" w:bidi="en_US"/>
+        </w:rPr>
+        <w:t>another</w:t>
+      </w:r>
+      <w:r>
+        <w:rPr>
+          <w:lang w:val="en_US" w:bidi="en_US"/>
+        </w:rPr>
+        <w:t xml:space="preserve"> "Advocate" (</w:t>
+      </w:r>
+      <w:hyperlink r:id="rId84">
+        <w:r>
+          <w:rPr>
+            <w:lang w:val="en_US" w:bidi="en_US"/>
+          </w:rPr>
+          <w:rPr>
+            <w:color w:val="0000EE"/>
+            <w:u w:val="single"/>
+          </w:rPr>
+          <w:t>John 14:16</w:t>
+        </w:r>
+      </w:hyperlink>
+      <w:r>
+        <w:rPr>
+          <w:lang w:val="en_US" w:bidi="en_US"/>
+        </w:rPr>
+        <w:t xml:space="preserve">). Jesus, the first advocate, sent the Holy Spirit as the second Advocate (see </w:t>
+      </w:r>
+      <w:hyperlink r:id="rId88">
+        <w:r>
+          <w:rPr>
+            <w:lang w:val="en_US" w:bidi="en_US"/>
+          </w:rPr>
+          <w:rPr>
+            <w:color w:val="0000EE"/>
+            <w:u w:val="single"/>
+          </w:rPr>
+          <w:t>1 John 2:1</w:t>
+        </w:r>
+      </w:hyperlink>
+      <w:r>
+        <w:rPr>
+          <w:lang w:val="en_US" w:bidi="en_US"/>
+        </w:rPr>
+        <w:t xml:space="preserve">). Every task of the Spirit described in </w:t>
+      </w:r>
+      <w:hyperlink r:id="rId89">
+        <w:r>
+          <w:rPr>
+            <w:lang w:val="en_US" w:bidi="en_US"/>
+          </w:rPr>
+          <w:rPr>
+            <w:color w:val="0000EE"/>
+            <w:u w:val="single"/>
+          </w:rPr>
+          <w:t>John 14–16</w:t>
+        </w:r>
+      </w:hyperlink>
+      <w:r>
+        <w:rPr>
+          <w:lang w:val="en_US" w:bidi="en_US"/>
+        </w:rPr>
+        <w:t xml:space="preserve"> is a task Jesus performed elsewhere in the gospel stories. Jesus promised that the Holy Spirit would come to encourage, instruct, and strengthen his followers. The Spirit would maintain Jesus' presence among his disciples. Five promises about the Spirit show different works the Spirit does (</w:t>
+      </w:r>
+      <w:hyperlink r:id="rId90">
+        <w:r>
+          <w:rPr>
+            <w:lang w:val="en_US" w:bidi="en_US"/>
+          </w:rPr>
+          <w:rPr>
+            <w:color w:val="0000EE"/>
+            <w:u w:val="single"/>
+          </w:rPr>
+          <w:t>John 14:16–17</w:t>
         </w:r>
       </w:hyperlink>
       <w:r>
@@ -1254,16 +2391,52 @@
         </w:rPr>
         <w:t xml:space="preserve">, </w:t>
       </w:r>
-      <w:hyperlink r:id="rId25">
-        <w:r>
-          <w:rPr>
-            <w:lang w:val="en_US" w:bidi="en_US"/>
-          </w:rPr>
-          <w:rPr>
-            <w:color w:val="0000EE"/>
-            <w:u w:val="single"/>
-          </w:rPr>
-          <w:t>9</w:t>
+      <w:hyperlink r:id="rId85">
+        <w:r>
+          <w:rPr>
+            <w:lang w:val="en_US" w:bidi="en_US"/>
+          </w:rPr>
+          <w:rPr>
+            <w:color w:val="0000EE"/>
+            <w:u w:val="single"/>
+          </w:rPr>
+          <w:t>26</w:t>
+        </w:r>
+      </w:hyperlink>
+      <w:r>
+        <w:rPr>
+          <w:lang w:val="en_US" w:bidi="en_US"/>
+        </w:rPr>
+        <w:t xml:space="preserve">; </w:t>
+      </w:r>
+      <w:hyperlink r:id="rId86">
+        <w:r>
+          <w:rPr>
+            <w:lang w:val="en_US" w:bidi="en_US"/>
+          </w:rPr>
+          <w:rPr>
+            <w:color w:val="0000EE"/>
+            <w:u w:val="single"/>
+          </w:rPr>
+          <w:t>15:26</w:t>
+        </w:r>
+      </w:hyperlink>
+      <w:r>
+        <w:rPr>
+          <w:lang w:val="en_US" w:bidi="en_US"/>
+        </w:rPr>
+        <w:t xml:space="preserve">; </w:t>
+      </w:r>
+      <w:hyperlink r:id="rId91">
+        <w:r>
+          <w:rPr>
+            <w:lang w:val="en_US" w:bidi="en_US"/>
+          </w:rPr>
+          <w:rPr>
+            <w:color w:val="0000EE"/>
+            <w:u w:val="single"/>
+          </w:rPr>
+          <w:t>16:7–8</w:t>
         </w:r>
       </w:hyperlink>
       <w:r>
@@ -1272,16 +2445,607 @@
         </w:rPr>
         <w:t xml:space="preserve">, </w:t>
       </w:r>
-      <w:hyperlink r:id="rId26">
-        <w:r>
-          <w:rPr>
-            <w:lang w:val="en_US" w:bidi="en_US"/>
-          </w:rPr>
-          <w:rPr>
-            <w:color w:val="0000EE"/>
-            <w:u w:val="single"/>
-          </w:rPr>
-          <w:t>14–15</w:t>
+      <w:hyperlink r:id="rId92">
+        <w:r>
+          <w:rPr>
+            <w:lang w:val="en_US" w:bidi="en_US"/>
+          </w:rPr>
+          <w:rPr>
+            <w:color w:val="0000EE"/>
+            <w:u w:val="single"/>
+          </w:rPr>
+          <w:t>13–14</w:t>
+        </w:r>
+      </w:hyperlink>
+      <w:r>
+        <w:rPr>
+          <w:lang w:val="en_US" w:bidi="en_US"/>
+        </w:rPr>
+        <w:t>).</w:t>
+      </w:r>
+    </w:p>
+    <w:p>
+      <w:pPr/>
+      <w:r>
+        <w:rPr>
+          <w:lang w:val="en_US" w:bidi="en_US"/>
+        </w:rPr>
+      </w:r>
+      <w:r>
+        <w:rPr>
+          <w:lang w:val="en_US" w:bidi="en_US"/>
+        </w:rPr>
+        <w:t xml:space="preserve">The Spirit became available to Jesus' disciples after his death (see </w:t>
+      </w:r>
+      <w:hyperlink r:id="rId93">
+        <w:r>
+          <w:rPr>
+            <w:lang w:val="en_US" w:bidi="en_US"/>
+          </w:rPr>
+          <w:rPr>
+            <w:color w:val="0000EE"/>
+            <w:u w:val="single"/>
+          </w:rPr>
+          <w:t>John 7:39</w:t>
+        </w:r>
+      </w:hyperlink>
+      <w:r>
+        <w:rPr>
+          <w:lang w:val="en_US" w:bidi="en_US"/>
+        </w:rPr>
+        <w:t xml:space="preserve">; </w:t>
+      </w:r>
+      <w:hyperlink r:id="rId94">
+        <w:r>
+          <w:rPr>
+            <w:lang w:val="en_US" w:bidi="en_US"/>
+          </w:rPr>
+          <w:rPr>
+            <w:color w:val="0000EE"/>
+            <w:u w:val="single"/>
+          </w:rPr>
+          <w:t>20:22</w:t>
+        </w:r>
+      </w:hyperlink>
+      <w:r>
+        <w:rPr>
+          <w:lang w:val="en_US" w:bidi="en_US"/>
+        </w:rPr>
+        <w:t>). The Spirit now continues Jesus' work and presence in the lives of Christians (</w:t>
+      </w:r>
+      <w:hyperlink r:id="rId95">
+        <w:r>
+          <w:rPr>
+            <w:lang w:val="en_US" w:bidi="en_US"/>
+          </w:rPr>
+          <w:rPr>
+            <w:color w:val="0000EE"/>
+            <w:u w:val="single"/>
+          </w:rPr>
+          <w:t>14:16–26</w:t>
+        </w:r>
+      </w:hyperlink>
+      <w:r>
+        <w:rPr>
+          <w:lang w:val="en_US" w:bidi="en_US"/>
+        </w:rPr>
+        <w:t>).</w:t>
+      </w:r>
+    </w:p>
+    <w:p>
+      <w:pPr/>
+      <w:r>
+        <w:rPr>
+          <w:lang w:val="en_US" w:bidi="en_US"/>
+        </w:rPr>
+      </w:r>
+      <w:r>
+        <w:rPr>
+          <w:u w:val="single"/>
+          <w:lang w:val="en_US" w:bidi="en_US"/>
+        </w:rPr>
+        <w:t>Passages for Further Study</w:t>
+      </w:r>
+    </w:p>
+    <w:p>
+      <w:pPr/>
+      <w:r>
+        <w:rPr>
+          <w:lang w:val="en_US" w:bidi="en_US"/>
+        </w:rPr>
+      </w:r>
+      <w:hyperlink r:id="rId96">
+        <w:r>
+          <w:rPr>
+            <w:lang w:val="en_US" w:bidi="en_US"/>
+          </w:rPr>
+          <w:rPr>
+            <w:color w:val="0000EE"/>
+            <w:u w:val="single"/>
+          </w:rPr>
+          <w:t>1 Samuel 2:25</w:t>
+        </w:r>
+      </w:hyperlink>
+      <w:r>
+        <w:rPr>
+          <w:lang w:val="en_US" w:bidi="en_US"/>
+        </w:rPr>
+        <w:t xml:space="preserve">; </w:t>
+      </w:r>
+      <w:hyperlink r:id="rId97">
+        <w:r>
+          <w:rPr>
+            <w:lang w:val="en_US" w:bidi="en_US"/>
+          </w:rPr>
+          <w:rPr>
+            <w:color w:val="0000EE"/>
+            <w:u w:val="single"/>
+          </w:rPr>
+          <w:t>24:15</w:t>
+        </w:r>
+      </w:hyperlink>
+      <w:r>
+        <w:rPr>
+          <w:lang w:val="en_US" w:bidi="en_US"/>
+        </w:rPr>
+        <w:t xml:space="preserve">; </w:t>
+      </w:r>
+      <w:hyperlink r:id="rId98">
+        <w:r>
+          <w:rPr>
+            <w:lang w:val="en_US" w:bidi="en_US"/>
+          </w:rPr>
+          <w:rPr>
+            <w:color w:val="0000EE"/>
+            <w:u w:val="single"/>
+          </w:rPr>
+          <w:t>2 Samuel 15:12</w:t>
+        </w:r>
+      </w:hyperlink>
+      <w:r>
+        <w:rPr>
+          <w:lang w:val="en_US" w:bidi="en_US"/>
+        </w:rPr>
+        <w:t xml:space="preserve">; </w:t>
+      </w:r>
+      <w:hyperlink r:id="rId99">
+        <w:r>
+          <w:rPr>
+            <w:lang w:val="en_US" w:bidi="en_US"/>
+          </w:rPr>
+          <w:rPr>
+            <w:color w:val="0000EE"/>
+            <w:u w:val="single"/>
+          </w:rPr>
+          <w:t>1 Kings 12:6–14</w:t>
+        </w:r>
+      </w:hyperlink>
+      <w:r>
+        <w:rPr>
+          <w:lang w:val="en_US" w:bidi="en_US"/>
+        </w:rPr>
+        <w:t xml:space="preserve">; </w:t>
+      </w:r>
+      <w:hyperlink r:id="rId100">
+        <w:r>
+          <w:rPr>
+            <w:lang w:val="en_US" w:bidi="en_US"/>
+          </w:rPr>
+          <w:rPr>
+            <w:color w:val="0000EE"/>
+            <w:u w:val="single"/>
+          </w:rPr>
+          <w:t>1 Chronicles 27:32</w:t>
+        </w:r>
+      </w:hyperlink>
+      <w:r>
+        <w:rPr>
+          <w:lang w:val="en_US" w:bidi="en_US"/>
+        </w:rPr>
+        <w:t xml:space="preserve">; </w:t>
+      </w:r>
+      <w:hyperlink r:id="rId101">
+        <w:r>
+          <w:rPr>
+            <w:lang w:val="en_US" w:bidi="en_US"/>
+          </w:rPr>
+          <w:rPr>
+            <w:color w:val="0000EE"/>
+            <w:u w:val="single"/>
+          </w:rPr>
+          <w:t>Job 16:18–22</w:t>
+        </w:r>
+      </w:hyperlink>
+      <w:r>
+        <w:rPr>
+          <w:lang w:val="en_US" w:bidi="en_US"/>
+        </w:rPr>
+        <w:t xml:space="preserve">; </w:t>
+      </w:r>
+      <w:hyperlink r:id="rId102">
+        <w:r>
+          <w:rPr>
+            <w:lang w:val="en_US" w:bidi="en_US"/>
+          </w:rPr>
+          <w:rPr>
+            <w:color w:val="0000EE"/>
+            <w:u w:val="single"/>
+          </w:rPr>
+          <w:t>Isaiah 1:26</w:t>
+        </w:r>
+      </w:hyperlink>
+      <w:r>
+        <w:rPr>
+          <w:lang w:val="en_US" w:bidi="en_US"/>
+        </w:rPr>
+        <w:t xml:space="preserve">; </w:t>
+      </w:r>
+      <w:hyperlink r:id="rId103">
+        <w:r>
+          <w:rPr>
+            <w:lang w:val="en_US" w:bidi="en_US"/>
+          </w:rPr>
+          <w:rPr>
+            <w:color w:val="0000EE"/>
+            <w:u w:val="single"/>
+          </w:rPr>
+          <w:t>9:6</w:t>
+        </w:r>
+      </w:hyperlink>
+      <w:r>
+        <w:rPr>
+          <w:lang w:val="en_US" w:bidi="en_US"/>
+        </w:rPr>
+        <w:t xml:space="preserve">; </w:t>
+      </w:r>
+      <w:hyperlink r:id="rId104">
+        <w:r>
+          <w:rPr>
+            <w:lang w:val="en_US" w:bidi="en_US"/>
+          </w:rPr>
+          <w:rPr>
+            <w:color w:val="0000EE"/>
+            <w:u w:val="single"/>
+          </w:rPr>
+          <w:t>John 14:1–16:15</w:t>
+        </w:r>
+      </w:hyperlink>
+      <w:r>
+        <w:rPr>
+          <w:lang w:val="en_US" w:bidi="en_US"/>
+        </w:rPr>
+        <w:t xml:space="preserve">; </w:t>
+      </w:r>
+      <w:hyperlink r:id="rId105">
+        <w:r>
+          <w:rPr>
+            <w:lang w:val="en_US" w:bidi="en_US"/>
+          </w:rPr>
+          <w:rPr>
+            <w:color w:val="0000EE"/>
+            <w:u w:val="single"/>
+          </w:rPr>
+          <w:t>Galatians 3:19–20</w:t>
+        </w:r>
+      </w:hyperlink>
+      <w:r>
+        <w:rPr>
+          <w:lang w:val="en_US" w:bidi="en_US"/>
+        </w:rPr>
+        <w:t xml:space="preserve">; </w:t>
+      </w:r>
+      <w:hyperlink r:id="rId106">
+        <w:r>
+          <w:rPr>
+            <w:lang w:val="en_US" w:bidi="en_US"/>
+          </w:rPr>
+          <w:rPr>
+            <w:color w:val="0000EE"/>
+            <w:u w:val="single"/>
+          </w:rPr>
+          <w:t>6:13</w:t>
+        </w:r>
+      </w:hyperlink>
+      <w:r>
+        <w:rPr>
+          <w:lang w:val="en_US" w:bidi="en_US"/>
+        </w:rPr>
+        <w:t xml:space="preserve">; </w:t>
+      </w:r>
+      <w:hyperlink r:id="rId107">
+        <w:r>
+          <w:rPr>
+            <w:lang w:val="en_US" w:bidi="en_US"/>
+          </w:rPr>
+          <w:rPr>
+            <w:color w:val="0000EE"/>
+            <w:u w:val="single"/>
+          </w:rPr>
+          <w:t>1 Timothy 2:5</w:t>
+        </w:r>
+      </w:hyperlink>
+      <w:r>
+        <w:rPr>
+          <w:lang w:val="en_US" w:bidi="en_US"/>
+        </w:rPr>
+        <w:t xml:space="preserve">; </w:t>
+      </w:r>
+      <w:hyperlink r:id="rId108">
+        <w:r>
+          <w:rPr>
+            <w:lang w:val="en_US" w:bidi="en_US"/>
+          </w:rPr>
+          <w:rPr>
+            <w:color w:val="0000EE"/>
+            <w:u w:val="single"/>
+          </w:rPr>
+          <w:t>Hebrews 8:6</w:t>
+        </w:r>
+      </w:hyperlink>
+      <w:r>
+        <w:rPr>
+          <w:lang w:val="en_US" w:bidi="en_US"/>
+        </w:rPr>
+        <w:t xml:space="preserve">; </w:t>
+      </w:r>
+      <w:hyperlink r:id="rId109">
+        <w:r>
+          <w:rPr>
+            <w:lang w:val="en_US" w:bidi="en_US"/>
+          </w:rPr>
+          <w:rPr>
+            <w:color w:val="0000EE"/>
+            <w:u w:val="single"/>
+          </w:rPr>
+          <w:t>9:15</w:t>
+        </w:r>
+      </w:hyperlink>
+      <w:r>
+        <w:rPr>
+          <w:lang w:val="en_US" w:bidi="en_US"/>
+        </w:rPr>
+        <w:t xml:space="preserve">; </w:t>
+      </w:r>
+      <w:hyperlink r:id="rId110">
+        <w:r>
+          <w:rPr>
+            <w:lang w:val="en_US" w:bidi="en_US"/>
+          </w:rPr>
+          <w:rPr>
+            <w:color w:val="0000EE"/>
+            <w:u w:val="single"/>
+          </w:rPr>
+          <w:t>12:24</w:t>
+        </w:r>
+      </w:hyperlink>
+      <w:r>
+        <w:rPr>
+          <w:lang w:val="en_US" w:bidi="en_US"/>
+        </w:rPr>
+        <w:t xml:space="preserve">; </w:t>
+      </w:r>
+      <w:hyperlink r:id="rId88">
+        <w:r>
+          <w:rPr>
+            <w:lang w:val="en_US" w:bidi="en_US"/>
+          </w:rPr>
+          <w:rPr>
+            <w:color w:val="0000EE"/>
+            <w:u w:val="single"/>
+          </w:rPr>
+          <w:t>1 John 2:1</w:t>
+        </w:r>
+      </w:hyperlink>
+      <w:r>
+        <w:rPr>
+          <w:lang w:val="en_US" w:bidi="en_US"/>
+        </w:rPr>
+      </w:r>
+      <w:r>
+        <w:rPr>
+          <w:lang w:val="en_US" w:bidi="en_US"/>
+        </w:rPr>
+      </w:r>
+    </w:p>
+    <w:p>
+      <w:pPr/>
+      <w:r>
+        <w:rPr>
+          <w:lang w:val="en_US" w:bidi="en_US"/>
+        </w:rPr>
+      </w:r>
+    </w:p>
+    <w:p>
+      <w:pPr>
+        <w:pStyle w:val="Heading2"/>
+      </w:pPr>
+      <w:r>
+        <w:rPr>
+          <w:lang w:val="en_US" w:bidi="en_US"/>
+        </w:rPr>
+        <w:t>Overcoming the Devil</w:t>
+      </w:r>
+      <w:r>
+        <w:rPr>
+          <w:lang w:val="en_US" w:bidi="en_US"/>
+        </w:rPr>
+      </w:r>
+    </w:p>
+    <w:p>
+      <w:pPr/>
+      <w:r>
+        <w:rPr>
+          <w:lang w:val="en_US" w:bidi="en_US"/>
+        </w:rPr>
+      </w:r>
+      <w:r>
+        <w:rPr>
+          <w:lang w:val="en_US" w:bidi="en_US"/>
+        </w:rPr>
+        <w:t xml:space="preserve">The New Testament writers believed in the reality of evil and the dangers of the spiritual world. They saw Satan, also known as "the evil one" or "the devil," as a serious threat. The devil blocks the work of God's people (see </w:t>
+      </w:r>
+      <w:hyperlink r:id="rId111">
+        <w:r>
+          <w:rPr>
+            <w:lang w:val="en_US" w:bidi="en_US"/>
+          </w:rPr>
+          <w:rPr>
+            <w:color w:val="0000EE"/>
+            <w:u w:val="single"/>
+          </w:rPr>
+          <w:t>1 Thessalonians 2:18</w:t>
+        </w:r>
+      </w:hyperlink>
+      <w:r>
+        <w:rPr>
+          <w:lang w:val="en_US" w:bidi="en_US"/>
+        </w:rPr>
+        <w:t xml:space="preserve">; </w:t>
+      </w:r>
+      <w:hyperlink r:id="rId112">
+        <w:r>
+          <w:rPr>
+            <w:lang w:val="en_US" w:bidi="en_US"/>
+          </w:rPr>
+          <w:rPr>
+            <w:color w:val="0000EE"/>
+            <w:u w:val="single"/>
+          </w:rPr>
+          <w:t>Revelation 2:10</w:t>
+        </w:r>
+      </w:hyperlink>
+      <w:r>
+        <w:rPr>
+          <w:lang w:val="en_US" w:bidi="en_US"/>
+        </w:rPr>
+        <w:t>). He "</w:t>
+      </w:r>
+      <w:r>
+        <w:rPr>
+          <w:lang w:val="en_US" w:bidi="en_US"/>
+        </w:rPr>
+        <w:t>prowls around like a roaring lion, seeking someone to devour</w:t>
+      </w:r>
+      <w:r>
+        <w:rPr>
+          <w:lang w:val="en_US" w:bidi="en_US"/>
+        </w:rPr>
+        <w:t>" (</w:t>
+      </w:r>
+      <w:hyperlink r:id="rId113">
+        <w:r>
+          <w:rPr>
+            <w:lang w:val="en_US" w:bidi="en_US"/>
+          </w:rPr>
+          <w:rPr>
+            <w:color w:val="0000EE"/>
+            <w:u w:val="single"/>
+          </w:rPr>
+          <w:t>1 Peter 5:8</w:t>
+        </w:r>
+      </w:hyperlink>
+      <w:r>
+        <w:rPr>
+          <w:lang w:val="en_US" w:bidi="en_US"/>
+        </w:rPr>
+        <w:t>).</w:t>
+      </w:r>
+    </w:p>
+    <w:p>
+      <w:pPr/>
+      <w:r>
+        <w:rPr>
+          <w:lang w:val="en_US" w:bidi="en_US"/>
+        </w:rPr>
+      </w:r>
+      <w:r>
+        <w:rPr>
+          <w:lang w:val="en_US" w:bidi="en_US"/>
+        </w:rPr>
+        <w:t xml:space="preserve">The entire world that does not trust in Christ is under the power of sin and the devil (see </w:t>
+      </w:r>
+      <w:hyperlink r:id="rId114">
+        <w:r>
+          <w:rPr>
+            <w:lang w:val="en_US" w:bidi="en_US"/>
+          </w:rPr>
+          <w:rPr>
+            <w:color w:val="0000EE"/>
+            <w:u w:val="single"/>
+          </w:rPr>
+          <w:t>Ephesians 2:2</w:t>
+        </w:r>
+      </w:hyperlink>
+      <w:r>
+        <w:rPr>
+          <w:lang w:val="en_US" w:bidi="en_US"/>
+        </w:rPr>
+        <w:t xml:space="preserve">; </w:t>
+      </w:r>
+      <w:hyperlink r:id="rId115">
+        <w:r>
+          <w:rPr>
+            <w:lang w:val="en_US" w:bidi="en_US"/>
+          </w:rPr>
+          <w:rPr>
+            <w:color w:val="0000EE"/>
+            <w:u w:val="single"/>
+          </w:rPr>
+          <w:t>1 John 5:19</w:t>
+        </w:r>
+      </w:hyperlink>
+      <w:r>
+        <w:rPr>
+          <w:lang w:val="en_US" w:bidi="en_US"/>
+        </w:rPr>
+        <w:t xml:space="preserve">). Paul calls the devil "the god of this age has blinded the minds of unbelievers" (see </w:t>
+      </w:r>
+      <w:hyperlink r:id="rId116">
+        <w:r>
+          <w:rPr>
+            <w:lang w:val="en_US" w:bidi="en_US"/>
+          </w:rPr>
+          <w:rPr>
+            <w:color w:val="0000EE"/>
+            <w:u w:val="single"/>
+          </w:rPr>
+          <w:t>2 Corinthians 4:4</w:t>
+        </w:r>
+      </w:hyperlink>
+      <w:r>
+        <w:rPr>
+          <w:lang w:val="en_US" w:bidi="en_US"/>
+        </w:rPr>
+        <w:t xml:space="preserve">; compare </w:t>
+      </w:r>
+      <w:hyperlink r:id="rId117">
+        <w:r>
+          <w:rPr>
+            <w:lang w:val="en_US" w:bidi="en_US"/>
+          </w:rPr>
+          <w:rPr>
+            <w:color w:val="0000EE"/>
+            <w:u w:val="single"/>
+          </w:rPr>
+          <w:t>Matthew 13:19</w:t>
+        </w:r>
+      </w:hyperlink>
+      <w:r>
+        <w:rPr>
+          <w:lang w:val="en_US" w:bidi="en_US"/>
+        </w:rPr>
+        <w:t>). Satan opposes God and tries to destroy his people (</w:t>
+      </w:r>
+      <w:hyperlink r:id="rId118">
+        <w:r>
+          <w:rPr>
+            <w:lang w:val="en_US" w:bidi="en_US"/>
+          </w:rPr>
+          <w:rPr>
+            <w:color w:val="0000EE"/>
+            <w:u w:val="single"/>
+          </w:rPr>
+          <w:t>Revelation 12:12</w:t>
         </w:r>
       </w:hyperlink>
       <w:r>
@@ -1290,16 +3054,170 @@
         </w:rPr>
         <w:t xml:space="preserve">, </w:t>
       </w:r>
-      <w:hyperlink r:id="rId27">
-        <w:r>
-          <w:rPr>
-            <w:lang w:val="en_US" w:bidi="en_US"/>
-          </w:rPr>
-          <w:rPr>
-            <w:color w:val="0000EE"/>
-            <w:u w:val="single"/>
-          </w:rPr>
-          <w:t>20</w:t>
+      <w:hyperlink r:id="rId119">
+        <w:r>
+          <w:rPr>
+            <w:lang w:val="en_US" w:bidi="en_US"/>
+          </w:rPr>
+          <w:rPr>
+            <w:color w:val="0000EE"/>
+            <w:u w:val="single"/>
+          </w:rPr>
+          <w:t>17</w:t>
+        </w:r>
+      </w:hyperlink>
+      <w:r>
+        <w:rPr>
+          <w:lang w:val="en_US" w:bidi="en_US"/>
+        </w:rPr>
+        <w:t>). But Jesus came to destroy "the works of the devil" (</w:t>
+      </w:r>
+      <w:hyperlink r:id="rId120">
+        <w:r>
+          <w:rPr>
+            <w:lang w:val="en_US" w:bidi="en_US"/>
+          </w:rPr>
+          <w:rPr>
+            <w:color w:val="0000EE"/>
+            <w:u w:val="single"/>
+          </w:rPr>
+          <w:t>1 John 3:8</w:t>
+        </w:r>
+      </w:hyperlink>
+      <w:r>
+        <w:rPr>
+          <w:lang w:val="en_US" w:bidi="en_US"/>
+        </w:rPr>
+        <w:t xml:space="preserve">). </w:t>
+      </w:r>
+    </w:p>
+    <w:p>
+      <w:pPr/>
+      <w:r>
+        <w:rPr>
+          <w:lang w:val="en_US" w:bidi="en_US"/>
+        </w:rPr>
+      </w:r>
+      <w:r>
+        <w:rPr>
+          <w:lang w:val="en_US" w:bidi="en_US"/>
+        </w:rPr>
+        <w:t xml:space="preserve">God changes into good what the devil intends for evil. Following this idea, the apostle Paul tells the church at Corinth to remove someone from the Christian community. This way, by encountering the devil's destructive power, that person would repent and find salvation (see </w:t>
+      </w:r>
+      <w:hyperlink r:id="rId121">
+        <w:r>
+          <w:rPr>
+            <w:lang w:val="en_US" w:bidi="en_US"/>
+          </w:rPr>
+          <w:rPr>
+            <w:color w:val="0000EE"/>
+            <w:u w:val="single"/>
+          </w:rPr>
+          <w:t>1 Corinthians 5:5</w:t>
+        </w:r>
+      </w:hyperlink>
+      <w:r>
+        <w:rPr>
+          <w:lang w:val="en_US" w:bidi="en_US"/>
+        </w:rPr>
+        <w:t>).</w:t>
+      </w:r>
+    </w:p>
+    <w:p>
+      <w:pPr/>
+      <w:r>
+        <w:rPr>
+          <w:lang w:val="en_US" w:bidi="en_US"/>
+        </w:rPr>
+      </w:r>
+      <w:r>
+        <w:rPr>
+          <w:lang w:val="en_US" w:bidi="en_US"/>
+        </w:rPr>
+        <w:t>Christians should submit to God and resist the devil (</w:t>
+      </w:r>
+      <w:hyperlink r:id="rId122">
+        <w:r>
+          <w:rPr>
+            <w:lang w:val="en_US" w:bidi="en_US"/>
+          </w:rPr>
+          <w:rPr>
+            <w:color w:val="0000EE"/>
+            <w:u w:val="single"/>
+          </w:rPr>
+          <w:t>James 4:7</w:t>
+        </w:r>
+      </w:hyperlink>
+      <w:r>
+        <w:rPr>
+          <w:lang w:val="en_US" w:bidi="en_US"/>
+        </w:rPr>
+        <w:t>). They should pray for God's help (</w:t>
+      </w:r>
+      <w:hyperlink r:id="rId123">
+        <w:r>
+          <w:rPr>
+            <w:lang w:val="en_US" w:bidi="en_US"/>
+          </w:rPr>
+          <w:rPr>
+            <w:color w:val="0000EE"/>
+            <w:u w:val="single"/>
+          </w:rPr>
+          <w:t>Matthew 6:13</w:t>
+        </w:r>
+      </w:hyperlink>
+      <w:r>
+        <w:rPr>
+          <w:lang w:val="en_US" w:bidi="en_US"/>
+        </w:rPr>
+        <w:t>). They should use the spiritual armor God provides for protection (</w:t>
+      </w:r>
+      <w:hyperlink r:id="rId124">
+        <w:r>
+          <w:rPr>
+            <w:lang w:val="en_US" w:bidi="en_US"/>
+          </w:rPr>
+          <w:rPr>
+            <w:color w:val="0000EE"/>
+            <w:u w:val="single"/>
+          </w:rPr>
+          <w:t>Ephesians 6:10–20</w:t>
+        </w:r>
+      </w:hyperlink>
+      <w:r>
+        <w:rPr>
+          <w:lang w:val="en_US" w:bidi="en_US"/>
+        </w:rPr>
+        <w:t xml:space="preserve">). Those who obey Satan experience consequences (see </w:t>
+      </w:r>
+      <w:hyperlink r:id="rId125">
+        <w:r>
+          <w:rPr>
+            <w:lang w:val="en_US" w:bidi="en_US"/>
+          </w:rPr>
+          <w:rPr>
+            <w:color w:val="0000EE"/>
+            <w:u w:val="single"/>
+          </w:rPr>
+          <w:t>Acts 5:1–5</w:t>
+        </w:r>
+      </w:hyperlink>
+      <w:r>
+        <w:rPr>
+          <w:lang w:val="en_US" w:bidi="en_US"/>
+        </w:rPr>
+        <w:t xml:space="preserve">). Obedient Christians are safe because they know Christ's death on the cross has stopped the devil's power (see </w:t>
+      </w:r>
+      <w:hyperlink r:id="rId126">
+        <w:r>
+          <w:rPr>
+            <w:lang w:val="en_US" w:bidi="en_US"/>
+          </w:rPr>
+          <w:rPr>
+            <w:color w:val="0000EE"/>
+            <w:u w:val="single"/>
+          </w:rPr>
+          <w:t>Romans 8:38–39</w:t>
         </w:r>
       </w:hyperlink>
       <w:r>
@@ -1308,16 +3226,16 @@
         </w:rPr>
         <w:t xml:space="preserve">; </w:t>
       </w:r>
-      <w:hyperlink r:id="rId28">
-        <w:r>
-          <w:rPr>
-            <w:lang w:val="en_US" w:bidi="en_US"/>
-          </w:rPr>
-          <w:rPr>
-            <w:color w:val="0000EE"/>
-            <w:u w:val="single"/>
-          </w:rPr>
-          <w:t>6:16</w:t>
+      <w:hyperlink r:id="rId127">
+        <w:r>
+          <w:rPr>
+            <w:lang w:val="en_US" w:bidi="en_US"/>
+          </w:rPr>
+          <w:rPr>
+            <w:color w:val="0000EE"/>
+            <w:u w:val="single"/>
+          </w:rPr>
+          <w:t>1 Corinthians 15:24</w:t>
         </w:r>
       </w:hyperlink>
       <w:r>
@@ -1326,16 +3244,16 @@
         </w:rPr>
         <w:t xml:space="preserve">; </w:t>
       </w:r>
-      <w:hyperlink r:id="rId45">
-        <w:r>
-          <w:rPr>
-            <w:lang w:val="en_US" w:bidi="en_US"/>
-          </w:rPr>
-          <w:rPr>
-            <w:color w:val="0000EE"/>
-            <w:u w:val="single"/>
-          </w:rPr>
-          <w:t>9:6–31</w:t>
+      <w:hyperlink r:id="rId128">
+        <w:r>
+          <w:rPr>
+            <w:lang w:val="en_US" w:bidi="en_US"/>
+          </w:rPr>
+          <w:rPr>
+            <w:color w:val="0000EE"/>
+            <w:u w:val="single"/>
+          </w:rPr>
+          <w:t>Colossians 1:13</w:t>
         </w:r>
       </w:hyperlink>
       <w:r>
@@ -1344,16 +3262,34 @@
         </w:rPr>
         <w:t xml:space="preserve">; </w:t>
       </w:r>
-      <w:hyperlink r:id="rId46">
-        <w:r>
-          <w:rPr>
-            <w:lang w:val="en_US" w:bidi="en_US"/>
-          </w:rPr>
-          <w:rPr>
-            <w:color w:val="0000EE"/>
-            <w:u w:val="single"/>
-          </w:rPr>
-          <w:t>Psalms 4:5</w:t>
+      <w:hyperlink r:id="rId129">
+        <w:r>
+          <w:rPr>
+            <w:lang w:val="en_US" w:bidi="en_US"/>
+          </w:rPr>
+          <w:rPr>
+            <w:color w:val="0000EE"/>
+            <w:u w:val="single"/>
+          </w:rPr>
+          <w:t>2:10</w:t>
+        </w:r>
+      </w:hyperlink>
+      <w:r>
+        <w:rPr>
+          <w:lang w:val="en_US" w:bidi="en_US"/>
+        </w:rPr>
+        <w:t xml:space="preserve">, </w:t>
+      </w:r>
+      <w:hyperlink r:id="rId130">
+        <w:r>
+          <w:rPr>
+            <w:lang w:val="en_US" w:bidi="en_US"/>
+          </w:rPr>
+          <w:rPr>
+            <w:color w:val="0000EE"/>
+            <w:u w:val="single"/>
+          </w:rPr>
+          <w:t>15</w:t>
         </w:r>
       </w:hyperlink>
       <w:r>
@@ -1362,16 +3298,175 @@
         </w:rPr>
         <w:t xml:space="preserve">; </w:t>
       </w:r>
-      <w:hyperlink r:id="rId47">
-        <w:r>
-          <w:rPr>
-            <w:lang w:val="en_US" w:bidi="en_US"/>
-          </w:rPr>
-          <w:rPr>
-            <w:color w:val="0000EE"/>
-            <w:u w:val="single"/>
-          </w:rPr>
-          <w:t>9:10</w:t>
+      <w:hyperlink r:id="rId131">
+        <w:r>
+          <w:rPr>
+            <w:lang w:val="en_US" w:bidi="en_US"/>
+          </w:rPr>
+          <w:rPr>
+            <w:color w:val="0000EE"/>
+            <w:u w:val="single"/>
+          </w:rPr>
+          <w:t>1 Peter 3:22</w:t>
+        </w:r>
+      </w:hyperlink>
+      <w:r>
+        <w:rPr>
+          <w:lang w:val="en_US" w:bidi="en_US"/>
+        </w:rPr>
+        <w:t xml:space="preserve">). </w:t>
+      </w:r>
+    </w:p>
+    <w:p>
+      <w:pPr/>
+      <w:r>
+        <w:rPr>
+          <w:lang w:val="en_US" w:bidi="en_US"/>
+        </w:rPr>
+      </w:r>
+      <w:r>
+        <w:rPr>
+          <w:lang w:val="en_US" w:bidi="en_US"/>
+        </w:rPr>
+        <w:t xml:space="preserve">The Lord protects them (see </w:t>
+      </w:r>
+      <w:hyperlink r:id="rId132">
+        <w:r>
+          <w:rPr>
+            <w:lang w:val="en_US" w:bidi="en_US"/>
+          </w:rPr>
+          <w:rPr>
+            <w:color w:val="0000EE"/>
+            <w:u w:val="single"/>
+          </w:rPr>
+          <w:t>1 John 5:18</w:t>
+        </w:r>
+      </w:hyperlink>
+      <w:r>
+        <w:rPr>
+          <w:lang w:val="en_US" w:bidi="en_US"/>
+        </w:rPr>
+        <w:t xml:space="preserve">). They also know the Holy Spirit within them is stronger than the devil (see </w:t>
+      </w:r>
+      <w:hyperlink r:id="rId133">
+        <w:r>
+          <w:rPr>
+            <w:lang w:val="en_US" w:bidi="en_US"/>
+          </w:rPr>
+          <w:rPr>
+            <w:color w:val="0000EE"/>
+            <w:u w:val="single"/>
+          </w:rPr>
+          <w:t>1 John 4:4</w:t>
+        </w:r>
+      </w:hyperlink>
+      <w:r>
+        <w:rPr>
+          <w:lang w:val="en_US" w:bidi="en_US"/>
+        </w:rPr>
+        <w:t xml:space="preserve">). Through God's word, they can defeat the evil one (see </w:t>
+      </w:r>
+      <w:hyperlink r:id="rId134">
+        <w:r>
+          <w:rPr>
+            <w:lang w:val="en_US" w:bidi="en_US"/>
+          </w:rPr>
+          <w:rPr>
+            <w:color w:val="0000EE"/>
+            <w:u w:val="single"/>
+          </w:rPr>
+          <w:t>1 John 2:14</w:t>
+        </w:r>
+      </w:hyperlink>
+      <w:r>
+        <w:rPr>
+          <w:lang w:val="en_US" w:bidi="en_US"/>
+        </w:rPr>
+        <w:t xml:space="preserve">; compare </w:t>
+      </w:r>
+      <w:hyperlink r:id="rId135">
+        <w:r>
+          <w:rPr>
+            <w:lang w:val="en_US" w:bidi="en_US"/>
+          </w:rPr>
+          <w:rPr>
+            <w:color w:val="0000EE"/>
+            <w:u w:val="single"/>
+          </w:rPr>
+          <w:t>Revelation 12:11</w:t>
+        </w:r>
+      </w:hyperlink>
+      <w:r>
+        <w:rPr>
+          <w:lang w:val="en_US" w:bidi="en_US"/>
+        </w:rPr>
+        <w:t>).</w:t>
+      </w:r>
+    </w:p>
+    <w:p>
+      <w:pPr/>
+      <w:r>
+        <w:rPr>
+          <w:lang w:val="en_US" w:bidi="en_US"/>
+        </w:rPr>
+      </w:r>
+      <w:r>
+        <w:rPr>
+          <w:lang w:val="en_US" w:bidi="en_US"/>
+        </w:rPr>
+        <w:t xml:space="preserve">Christians should be cautious of the devil and guard against his influence. But they should not live in fear. God's power is much greater than the devil's. In the end, God will completely defeat the devil (see </w:t>
+      </w:r>
+      <w:hyperlink r:id="rId136">
+        <w:r>
+          <w:rPr>
+            <w:lang w:val="en_US" w:bidi="en_US"/>
+          </w:rPr>
+          <w:rPr>
+            <w:color w:val="0000EE"/>
+            <w:u w:val="single"/>
+          </w:rPr>
+          <w:t>Revelation 20:7–10</w:t>
+        </w:r>
+      </w:hyperlink>
+      <w:r>
+        <w:rPr>
+          <w:lang w:val="en_US" w:bidi="en_US"/>
+        </w:rPr>
+        <w:t>).</w:t>
+      </w:r>
+    </w:p>
+    <w:p>
+      <w:pPr/>
+      <w:r>
+        <w:rPr>
+          <w:lang w:val="en_US" w:bidi="en_US"/>
+        </w:rPr>
+      </w:r>
+      <w:r>
+        <w:rPr>
+          <w:u w:val="single"/>
+          <w:lang w:val="en_US" w:bidi="en_US"/>
+        </w:rPr>
+        <w:t>Passages for Further Study</w:t>
+      </w:r>
+    </w:p>
+    <w:p>
+      <w:pPr/>
+      <w:r>
+        <w:rPr>
+          <w:lang w:val="en_US" w:bidi="en_US"/>
+        </w:rPr>
+      </w:r>
+      <w:hyperlink r:id="rId123">
+        <w:r>
+          <w:rPr>
+            <w:lang w:val="en_US" w:bidi="en_US"/>
+          </w:rPr>
+          <w:rPr>
+            <w:color w:val="0000EE"/>
+            <w:u w:val="single"/>
+          </w:rPr>
+          <w:t>Matthew 6:13</w:t>
         </w:r>
       </w:hyperlink>
       <w:r>
@@ -1380,16 +3475,16 @@
         </w:rPr>
         <w:t xml:space="preserve">; </w:t>
       </w:r>
-      <w:hyperlink r:id="rId48">
-        <w:r>
-          <w:rPr>
-            <w:lang w:val="en_US" w:bidi="en_US"/>
-          </w:rPr>
-          <w:rPr>
-            <w:color w:val="0000EE"/>
-            <w:u w:val="single"/>
-          </w:rPr>
-          <w:t>37:3</w:t>
+      <w:hyperlink r:id="rId117">
+        <w:r>
+          <w:rPr>
+            <w:lang w:val="en_US" w:bidi="en_US"/>
+          </w:rPr>
+          <w:rPr>
+            <w:color w:val="0000EE"/>
+            <w:u w:val="single"/>
+          </w:rPr>
+          <w:t>13:19</w:t>
         </w:r>
       </w:hyperlink>
       <w:r>
@@ -1398,16 +3493,16 @@
         </w:rPr>
         <w:t xml:space="preserve">; </w:t>
       </w:r>
-      <w:hyperlink r:id="rId49">
-        <w:r>
-          <w:rPr>
-            <w:lang w:val="en_US" w:bidi="en_US"/>
-          </w:rPr>
-          <w:rPr>
-            <w:color w:val="0000EE"/>
-            <w:u w:val="single"/>
-          </w:rPr>
-          <w:t>40:3</w:t>
+      <w:hyperlink r:id="rId137">
+        <w:r>
+          <w:rPr>
+            <w:lang w:val="en_US" w:bidi="en_US"/>
+          </w:rPr>
+          <w:rPr>
+            <w:color w:val="0000EE"/>
+            <w:u w:val="single"/>
+          </w:rPr>
+          <w:t>Acts 5:3–5</w:t>
         </w:r>
       </w:hyperlink>
       <w:r>
@@ -1416,16 +3511,16 @@
         </w:rPr>
         <w:t xml:space="preserve">; </w:t>
       </w:r>
-      <w:hyperlink r:id="rId50">
-        <w:r>
-          <w:rPr>
-            <w:lang w:val="en_US" w:bidi="en_US"/>
-          </w:rPr>
-          <w:rPr>
-            <w:color w:val="0000EE"/>
-            <w:u w:val="single"/>
-          </w:rPr>
-          <w:t>44:6–7</w:t>
+      <w:hyperlink r:id="rId126">
+        <w:r>
+          <w:rPr>
+            <w:lang w:val="en_US" w:bidi="en_US"/>
+          </w:rPr>
+          <w:rPr>
+            <w:color w:val="0000EE"/>
+            <w:u w:val="single"/>
+          </w:rPr>
+          <w:t>Romans 8:38–39</w:t>
         </w:r>
       </w:hyperlink>
       <w:r>
@@ -1434,16 +3529,16 @@
         </w:rPr>
         <w:t xml:space="preserve">; </w:t>
       </w:r>
-      <w:hyperlink r:id="rId51">
-        <w:r>
-          <w:rPr>
-            <w:lang w:val="en_US" w:bidi="en_US"/>
-          </w:rPr>
-          <w:rPr>
-            <w:color w:val="0000EE"/>
-            <w:u w:val="single"/>
-          </w:rPr>
-          <w:t>56:3–12</w:t>
+      <w:hyperlink r:id="rId121">
+        <w:r>
+          <w:rPr>
+            <w:lang w:val="en_US" w:bidi="en_US"/>
+          </w:rPr>
+          <w:rPr>
+            <w:color w:val="0000EE"/>
+            <w:u w:val="single"/>
+          </w:rPr>
+          <w:t>1 Corinthians 5:5</w:t>
         </w:r>
       </w:hyperlink>
       <w:r>
@@ -1452,16 +3547,16 @@
         </w:rPr>
         <w:t xml:space="preserve">; </w:t>
       </w:r>
-      <w:hyperlink r:id="rId52">
-        <w:r>
-          <w:rPr>
-            <w:lang w:val="en_US" w:bidi="en_US"/>
-          </w:rPr>
-          <w:rPr>
-            <w:color w:val="0000EE"/>
-            <w:u w:val="single"/>
-          </w:rPr>
-          <w:t>112:1–9</w:t>
+      <w:hyperlink r:id="rId127">
+        <w:r>
+          <w:rPr>
+            <w:lang w:val="en_US" w:bidi="en_US"/>
+          </w:rPr>
+          <w:rPr>
+            <w:color w:val="0000EE"/>
+            <w:u w:val="single"/>
+          </w:rPr>
+          <w:t>15:24</w:t>
         </w:r>
       </w:hyperlink>
       <w:r>
@@ -1470,16 +3565,16 @@
         </w:rPr>
         <w:t xml:space="preserve">; </w:t>
       </w:r>
-      <w:hyperlink r:id="rId53">
-        <w:r>
-          <w:rPr>
-            <w:lang w:val="en_US" w:bidi="en_US"/>
-          </w:rPr>
-          <w:rPr>
-            <w:color w:val="0000EE"/>
-            <w:u w:val="single"/>
-          </w:rPr>
-          <w:t>Proverbs 3:5–12</w:t>
+      <w:hyperlink r:id="rId116">
+        <w:r>
+          <w:rPr>
+            <w:lang w:val="en_US" w:bidi="en_US"/>
+          </w:rPr>
+          <w:rPr>
+            <w:color w:val="0000EE"/>
+            <w:u w:val="single"/>
+          </w:rPr>
+          <w:t>2 Corinthians 4:4</w:t>
         </w:r>
       </w:hyperlink>
       <w:r>
@@ -1488,16 +3583,16 @@
         </w:rPr>
         <w:t xml:space="preserve">; </w:t>
       </w:r>
-      <w:hyperlink r:id="rId54">
-        <w:r>
-          <w:rPr>
-            <w:lang w:val="en_US" w:bidi="en_US"/>
-          </w:rPr>
-          <w:rPr>
-            <w:color w:val="0000EE"/>
-            <w:u w:val="single"/>
-          </w:rPr>
-          <w:t>16:20</w:t>
+      <w:hyperlink r:id="rId114">
+        <w:r>
+          <w:rPr>
+            <w:lang w:val="en_US" w:bidi="en_US"/>
+          </w:rPr>
+          <w:rPr>
+            <w:color w:val="0000EE"/>
+            <w:u w:val="single"/>
+          </w:rPr>
+          <w:t>Ephesians 2:2</w:t>
         </w:r>
       </w:hyperlink>
       <w:r>
@@ -1506,16 +3601,70 @@
         </w:rPr>
         <w:t xml:space="preserve">; </w:t>
       </w:r>
-      <w:hyperlink r:id="rId55">
-        <w:r>
-          <w:rPr>
-            <w:lang w:val="en_US" w:bidi="en_US"/>
-          </w:rPr>
-          <w:rPr>
-            <w:color w:val="0000EE"/>
-            <w:u w:val="single"/>
-          </w:rPr>
-          <w:t>28:1</w:t>
+      <w:hyperlink r:id="rId138">
+        <w:r>
+          <w:rPr>
+            <w:lang w:val="en_US" w:bidi="en_US"/>
+          </w:rPr>
+          <w:rPr>
+            <w:color w:val="0000EE"/>
+            <w:u w:val="single"/>
+          </w:rPr>
+          <w:t>4:27</w:t>
+        </w:r>
+      </w:hyperlink>
+      <w:r>
+        <w:rPr>
+          <w:lang w:val="en_US" w:bidi="en_US"/>
+        </w:rPr>
+        <w:t xml:space="preserve">; </w:t>
+      </w:r>
+      <w:hyperlink r:id="rId124">
+        <w:r>
+          <w:rPr>
+            <w:lang w:val="en_US" w:bidi="en_US"/>
+          </w:rPr>
+          <w:rPr>
+            <w:color w:val="0000EE"/>
+            <w:u w:val="single"/>
+          </w:rPr>
+          <w:t>6:10–20</w:t>
+        </w:r>
+      </w:hyperlink>
+      <w:r>
+        <w:rPr>
+          <w:lang w:val="en_US" w:bidi="en_US"/>
+        </w:rPr>
+        <w:t xml:space="preserve">; </w:t>
+      </w:r>
+      <w:hyperlink r:id="rId128">
+        <w:r>
+          <w:rPr>
+            <w:lang w:val="en_US" w:bidi="en_US"/>
+          </w:rPr>
+          <w:rPr>
+            <w:color w:val="0000EE"/>
+            <w:u w:val="single"/>
+          </w:rPr>
+          <w:t>Colossians 1:13</w:t>
+        </w:r>
+      </w:hyperlink>
+      <w:r>
+        <w:rPr>
+          <w:lang w:val="en_US" w:bidi="en_US"/>
+        </w:rPr>
+        <w:t xml:space="preserve">; </w:t>
+      </w:r>
+      <w:hyperlink r:id="rId129">
+        <w:r>
+          <w:rPr>
+            <w:lang w:val="en_US" w:bidi="en_US"/>
+          </w:rPr>
+          <w:rPr>
+            <w:color w:val="0000EE"/>
+            <w:u w:val="single"/>
+          </w:rPr>
+          <w:t>2:10</w:t>
         </w:r>
       </w:hyperlink>
       <w:r>
@@ -1524,16 +3673,16 @@
         </w:rPr>
         <w:t xml:space="preserve">, </w:t>
       </w:r>
-      <w:hyperlink r:id="rId56">
-        <w:r>
-          <w:rPr>
-            <w:lang w:val="en_US" w:bidi="en_US"/>
-          </w:rPr>
-          <w:rPr>
-            <w:color w:val="0000EE"/>
-            <w:u w:val="single"/>
-          </w:rPr>
-          <w:t>25</w:t>
+      <w:hyperlink r:id="rId130">
+        <w:r>
+          <w:rPr>
+            <w:lang w:val="en_US" w:bidi="en_US"/>
+          </w:rPr>
+          <w:rPr>
+            <w:color w:val="0000EE"/>
+            <w:u w:val="single"/>
+          </w:rPr>
+          <w:t>15</w:t>
         </w:r>
       </w:hyperlink>
       <w:r>
@@ -1542,16 +3691,16 @@
         </w:rPr>
         <w:t xml:space="preserve">; </w:t>
       </w:r>
-      <w:hyperlink r:id="rId57">
-        <w:r>
-          <w:rPr>
-            <w:lang w:val="en_US" w:bidi="en_US"/>
-          </w:rPr>
-          <w:rPr>
-            <w:color w:val="0000EE"/>
-            <w:u w:val="single"/>
-          </w:rPr>
-          <w:t>Isaiah 26:3</w:t>
+      <w:hyperlink r:id="rId111">
+        <w:r>
+          <w:rPr>
+            <w:lang w:val="en_US" w:bidi="en_US"/>
+          </w:rPr>
+          <w:rPr>
+            <w:color w:val="0000EE"/>
+            <w:u w:val="single"/>
+          </w:rPr>
+          <w:t>1 Thessalonians 2:18</w:t>
         </w:r>
       </w:hyperlink>
       <w:r>
@@ -1560,16 +3709,160 @@
         </w:rPr>
         <w:t xml:space="preserve">; </w:t>
       </w:r>
-      <w:hyperlink r:id="rId37">
-        <w:r>
-          <w:rPr>
-            <w:lang w:val="en_US" w:bidi="en_US"/>
-          </w:rPr>
-          <w:rPr>
-            <w:color w:val="0000EE"/>
-            <w:u w:val="single"/>
-          </w:rPr>
-          <w:t>Hebrews 11:8–10</w:t>
+      <w:hyperlink r:id="rId122">
+        <w:r>
+          <w:rPr>
+            <w:lang w:val="en_US" w:bidi="en_US"/>
+          </w:rPr>
+          <w:rPr>
+            <w:color w:val="0000EE"/>
+            <w:u w:val="single"/>
+          </w:rPr>
+          <w:t>James 4:7</w:t>
+        </w:r>
+      </w:hyperlink>
+      <w:r>
+        <w:rPr>
+          <w:lang w:val="en_US" w:bidi="en_US"/>
+        </w:rPr>
+        <w:t xml:space="preserve">; </w:t>
+      </w:r>
+      <w:hyperlink r:id="rId131">
+        <w:r>
+          <w:rPr>
+            <w:lang w:val="en_US" w:bidi="en_US"/>
+          </w:rPr>
+          <w:rPr>
+            <w:color w:val="0000EE"/>
+            <w:u w:val="single"/>
+          </w:rPr>
+          <w:t>1 Peter 3:22</w:t>
+        </w:r>
+      </w:hyperlink>
+      <w:r>
+        <w:rPr>
+          <w:lang w:val="en_US" w:bidi="en_US"/>
+        </w:rPr>
+        <w:t xml:space="preserve">; </w:t>
+      </w:r>
+      <w:hyperlink r:id="rId113">
+        <w:r>
+          <w:rPr>
+            <w:lang w:val="en_US" w:bidi="en_US"/>
+          </w:rPr>
+          <w:rPr>
+            <w:color w:val="0000EE"/>
+            <w:u w:val="single"/>
+          </w:rPr>
+          <w:t>5:8</w:t>
+        </w:r>
+      </w:hyperlink>
+      <w:r>
+        <w:rPr>
+          <w:lang w:val="en_US" w:bidi="en_US"/>
+        </w:rPr>
+        <w:t xml:space="preserve">; </w:t>
+      </w:r>
+      <w:hyperlink r:id="rId134">
+        <w:r>
+          <w:rPr>
+            <w:lang w:val="en_US" w:bidi="en_US"/>
+          </w:rPr>
+          <w:rPr>
+            <w:color w:val="0000EE"/>
+            <w:u w:val="single"/>
+          </w:rPr>
+          <w:t>1 John 2:14</w:t>
+        </w:r>
+      </w:hyperlink>
+      <w:r>
+        <w:rPr>
+          <w:lang w:val="en_US" w:bidi="en_US"/>
+        </w:rPr>
+        <w:t xml:space="preserve">; </w:t>
+      </w:r>
+      <w:hyperlink r:id="rId120">
+        <w:r>
+          <w:rPr>
+            <w:lang w:val="en_US" w:bidi="en_US"/>
+          </w:rPr>
+          <w:rPr>
+            <w:color w:val="0000EE"/>
+            <w:u w:val="single"/>
+          </w:rPr>
+          <w:t>3:8</w:t>
+        </w:r>
+      </w:hyperlink>
+      <w:r>
+        <w:rPr>
+          <w:lang w:val="en_US" w:bidi="en_US"/>
+        </w:rPr>
+        <w:t xml:space="preserve">; </w:t>
+      </w:r>
+      <w:hyperlink r:id="rId133">
+        <w:r>
+          <w:rPr>
+            <w:lang w:val="en_US" w:bidi="en_US"/>
+          </w:rPr>
+          <w:rPr>
+            <w:color w:val="0000EE"/>
+            <w:u w:val="single"/>
+          </w:rPr>
+          <w:t>4:4</w:t>
+        </w:r>
+      </w:hyperlink>
+      <w:r>
+        <w:rPr>
+          <w:lang w:val="en_US" w:bidi="en_US"/>
+        </w:rPr>
+        <w:t xml:space="preserve">; </w:t>
+      </w:r>
+      <w:hyperlink r:id="rId139">
+        <w:r>
+          <w:rPr>
+            <w:lang w:val="en_US" w:bidi="en_US"/>
+          </w:rPr>
+          <w:rPr>
+            <w:color w:val="0000EE"/>
+            <w:u w:val="single"/>
+          </w:rPr>
+          <w:t>5:18–19</w:t>
+        </w:r>
+      </w:hyperlink>
+      <w:r>
+        <w:rPr>
+          <w:lang w:val="en_US" w:bidi="en_US"/>
+        </w:rPr>
+        <w:t xml:space="preserve">; </w:t>
+      </w:r>
+      <w:hyperlink r:id="rId112">
+        <w:r>
+          <w:rPr>
+            <w:lang w:val="en_US" w:bidi="en_US"/>
+          </w:rPr>
+          <w:rPr>
+            <w:color w:val="0000EE"/>
+            <w:u w:val="single"/>
+          </w:rPr>
+          <w:t>Revelation 2:10</w:t>
+        </w:r>
+      </w:hyperlink>
+      <w:r>
+        <w:rPr>
+          <w:lang w:val="en_US" w:bidi="en_US"/>
+        </w:rPr>
+        <w:t xml:space="preserve">; </w:t>
+      </w:r>
+      <w:hyperlink r:id="rId140">
+        <w:r>
+          <w:rPr>
+            <w:lang w:val="en_US" w:bidi="en_US"/>
+          </w:rPr>
+          <w:rPr>
+            <w:color w:val="0000EE"/>
+            <w:u w:val="single"/>
+          </w:rPr>
+          <w:t>12:7–9</w:t>
         </w:r>
       </w:hyperlink>
       <w:r>
@@ -1578,34 +3871,34 @@
         </w:rPr>
         <w:t xml:space="preserve">, </w:t>
       </w:r>
-      <w:hyperlink r:id="rId39">
-        <w:r>
-          <w:rPr>
-            <w:lang w:val="en_US" w:bidi="en_US"/>
-          </w:rPr>
-          <w:rPr>
-            <w:color w:val="0000EE"/>
-            <w:u w:val="single"/>
-          </w:rPr>
-          <w:t>31</w:t>
-        </w:r>
-      </w:hyperlink>
-      <w:r>
-        <w:rPr>
-          <w:lang w:val="en_US" w:bidi="en_US"/>
-        </w:rPr>
-        <w:t xml:space="preserve">; </w:t>
-      </w:r>
-      <w:hyperlink r:id="rId58">
-        <w:r>
-          <w:rPr>
-            <w:lang w:val="en_US" w:bidi="en_US"/>
-          </w:rPr>
-          <w:rPr>
-            <w:color w:val="0000EE"/>
-            <w:u w:val="single"/>
-          </w:rPr>
-          <w:t>1 John 4:17</w:t>
+      <w:hyperlink r:id="rId141">
+        <w:r>
+          <w:rPr>
+            <w:lang w:val="en_US" w:bidi="en_US"/>
+          </w:rPr>
+          <w:rPr>
+            <w:color w:val="0000EE"/>
+            <w:u w:val="single"/>
+          </w:rPr>
+          <w:t>11–12</w:t>
+        </w:r>
+      </w:hyperlink>
+      <w:r>
+        <w:rPr>
+          <w:lang w:val="en_US" w:bidi="en_US"/>
+        </w:rPr>
+        <w:t xml:space="preserve">, </w:t>
+      </w:r>
+      <w:hyperlink r:id="rId119">
+        <w:r>
+          <w:rPr>
+            <w:lang w:val="en_US" w:bidi="en_US"/>
+          </w:rPr>
+          <w:rPr>
+            <w:color w:val="0000EE"/>
+            <w:u w:val="single"/>
+          </w:rPr>
+          <w:t>17</w:t>
         </w:r>
       </w:hyperlink>
       <w:r>
@@ -3508,12 +5801,6 @@
   </w:num>
   <w:num w:numId="13" w16cid:durableId="592781308">
     <w:abstractNumId w:val="11"/>
-  </w:num>
-  <w:num w:numId="14">
-    <w:abstractNumId w:val="3"/>
-    <w:lvlOverride w:ilvl="0">
-      <w:startOverride w:val="1"/>
-    </w:lvlOverride>
   </w:num>
   <w:numIdMacAtCleanup w:val="10"/>
 </w:numbering>

</xml_diff>